<commit_message>
Add Hebrew inline (transliteration + Hebrew in parens) to all 18 existing Sefer Edition rewrites — retroactive convention rollout
</commit_message>
<xml_diff>
--- a/sefer-edition/book-rewrites/2024-08-25 — אַשְׁרֵי — פֶּתַח לְעוֹלָם הַבָּא — Sefer Edition — styled.docx
+++ b/sefer-edition/book-rewrites/2024-08-25 — אַשְׁרֵי — פֶּתַח לְעוֹלָם הַבָּא — Sefer Edition — styled.docx
@@ -71,7 +71,27 @@
           <w:color w:val="1A1A1A"/>
           <w:sz w:val="22"/>
         </w:rPr>
-        <w:t xml:space="preserve"> his wife’s grandmother, </w:t>
+        <w:t xml:space="preserve"> (</w:t>
+      </w:r>
+      <w:r>
+        <w:rPr>
+          <w:rFonts w:ascii="SBL Hebrew" w:hAnsi="SBL Hebrew" w:cs="SBL Hebrew" w:eastAsia="SBL Hebrew"/>
+          <w:b w:val="0"/>
+          <w:i w:val="0"/>
+          <w:color w:val="1A1A1A"/>
+          <w:sz w:val="22"/>
+        </w:rPr>
+        <w:t>לְעִלּוּי נִשְׁמַת</w:t>
+      </w:r>
+      <w:r>
+        <w:rPr>
+          <w:rFonts w:ascii="Georgia" w:hAnsi="Georgia" w:cs="SBL Hebrew" w:eastAsia="Georgia"/>
+          <w:b w:val="0"/>
+          <w:i w:val="0"/>
+          <w:color w:val="1A1A1A"/>
+          <w:sz w:val="22"/>
+        </w:rPr>
+        <w:t xml:space="preserve">) his wife’s grandmother, </w:t>
       </w:r>
       <w:r>
         <w:rPr>
@@ -111,7 +131,27 @@
           <w:color w:val="1A1A1A"/>
           <w:sz w:val="22"/>
         </w:rPr>
-        <w:t>.</w:t>
+        <w:t xml:space="preserve"> (</w:t>
+      </w:r>
+      <w:r>
+        <w:rPr>
+          <w:rFonts w:ascii="SBL Hebrew" w:hAnsi="SBL Hebrew" w:cs="SBL Hebrew" w:eastAsia="SBL Hebrew"/>
+          <w:b w:val="0"/>
+          <w:i w:val="0"/>
+          <w:color w:val="1A1A1A"/>
+          <w:sz w:val="22"/>
+        </w:rPr>
+        <w:t>יאָרצייט</w:t>
+      </w:r>
+      <w:r>
+        <w:rPr>
+          <w:rFonts w:ascii="Georgia" w:hAnsi="Georgia" w:cs="SBL Hebrew" w:eastAsia="Georgia"/>
+          <w:b w:val="0"/>
+          <w:i w:val="0"/>
+          <w:color w:val="1A1A1A"/>
+          <w:sz w:val="22"/>
+        </w:rPr>
+        <w:t>).</w:t>
       </w:r>
       <w:r>
         <w:br/>
@@ -205,7 +245,27 @@
           <w:color w:val="1A1A1A"/>
           <w:sz w:val="22"/>
         </w:rPr>
-        <w:t xml:space="preserve"> and whose method of prayer, no less than his method of learning, was the fruit of a mind that refused to say a word it did not understand.</w:t>
+        <w:t xml:space="preserve"> (</w:t>
+      </w:r>
+      <w:r>
+        <w:rPr>
+          <w:rFonts w:ascii="SBL Hebrew" w:hAnsi="SBL Hebrew" w:cs="SBL Hebrew" w:eastAsia="SBL Hebrew"/>
+          <w:b w:val="0"/>
+          <w:i w:val="0"/>
+          <w:color w:val="1A1A1A"/>
+          <w:sz w:val="22"/>
+        </w:rPr>
+        <w:t>הֲבָנָה</w:t>
+      </w:r>
+      <w:r>
+        <w:rPr>
+          <w:rFonts w:ascii="Georgia" w:hAnsi="Georgia" w:cs="SBL Hebrew" w:eastAsia="Georgia"/>
+          <w:b w:val="0"/>
+          <w:i w:val="0"/>
+          <w:color w:val="1A1A1A"/>
+          <w:sz w:val="22"/>
+        </w:rPr>
+        <w:t>) and whose method of prayer, no less than his method of learning, was the fruit of a mind that refused to say a word it did not understand.</w:t>
       </w:r>
     </w:p>
     <w:p>
@@ -250,6 +310,36 @@
           <w:sz w:val="22"/>
         </w:rPr>
         <w:t>Berachos</w:t>
+      </w:r>
+      <w:r>
+        <w:rPr>
+          <w:rFonts w:ascii="Georgia" w:hAnsi="Georgia" w:cs="SBL Hebrew" w:eastAsia="Georgia"/>
+          <w:b w:val="0"/>
+          <w:i w:val="0"/>
+          <w:color w:val="1A1A1A"/>
+          <w:sz w:val="22"/>
+        </w:rPr>
+        <w:t xml:space="preserve"> (</w:t>
+      </w:r>
+      <w:r>
+        <w:rPr>
+          <w:rFonts w:ascii="SBL Hebrew" w:hAnsi="SBL Hebrew" w:cs="SBL Hebrew" w:eastAsia="SBL Hebrew"/>
+          <w:b w:val="0"/>
+          <w:i w:val="0"/>
+          <w:color w:val="1A1A1A"/>
+          <w:sz w:val="22"/>
+        </w:rPr>
+        <w:t>בְּרָכוֹת</w:t>
+      </w:r>
+      <w:r>
+        <w:rPr>
+          <w:rFonts w:ascii="Georgia" w:hAnsi="Georgia" w:cs="SBL Hebrew" w:eastAsia="Georgia"/>
+          <w:b w:val="0"/>
+          <w:i w:val="0"/>
+          <w:color w:val="1A1A1A"/>
+          <w:sz w:val="22"/>
+        </w:rPr>
+        <w:t>)</w:t>
       </w:r>
       <w:r>
         <w:rPr>
@@ -433,7 +523,27 @@
           <w:color w:val="1A1A1A"/>
           <w:sz w:val="22"/>
         </w:rPr>
-        <w:t xml:space="preserve"> identifies two features of this single </w:t>
+        <w:t xml:space="preserve"> (</w:t>
+      </w:r>
+      <w:r>
+        <w:rPr>
+          <w:rFonts w:ascii="SBL Hebrew" w:hAnsi="SBL Hebrew" w:cs="SBL Hebrew" w:eastAsia="SBL Hebrew"/>
+          <w:b w:val="0"/>
+          <w:i w:val="0"/>
+          <w:color w:val="1A1A1A"/>
+          <w:sz w:val="22"/>
+        </w:rPr>
+        <w:t>סוּגְיָא</w:t>
+      </w:r>
+      <w:r>
+        <w:rPr>
+          <w:rFonts w:ascii="Georgia" w:hAnsi="Georgia" w:cs="SBL Hebrew" w:eastAsia="Georgia"/>
+          <w:b w:val="0"/>
+          <w:i w:val="0"/>
+          <w:color w:val="1A1A1A"/>
+          <w:sz w:val="22"/>
+        </w:rPr>
+        <w:t xml:space="preserve">) identifies two features of this single </w:t>
       </w:r>
       <w:r>
         <w:rPr>
@@ -473,7 +583,27 @@
           <w:color w:val="1A1A1A"/>
           <w:sz w:val="22"/>
         </w:rPr>
-        <w:t xml:space="preserve"> acrostic structure, one </w:t>
+        <w:t xml:space="preserve"> (</w:t>
+      </w:r>
+      <w:r>
+        <w:rPr>
+          <w:rFonts w:ascii="SBL Hebrew" w:hAnsi="SBL Hebrew" w:cs="SBL Hebrew" w:eastAsia="SBL Hebrew"/>
+          <w:b w:val="0"/>
+          <w:i w:val="0"/>
+          <w:color w:val="1A1A1A"/>
+          <w:sz w:val="22"/>
+        </w:rPr>
+        <w:t>אָלֶף־בֵּית</w:t>
+      </w:r>
+      <w:r>
+        <w:rPr>
+          <w:rFonts w:ascii="Georgia" w:hAnsi="Georgia" w:cs="SBL Hebrew" w:eastAsia="Georgia"/>
+          <w:b w:val="0"/>
+          <w:i w:val="0"/>
+          <w:color w:val="1A1A1A"/>
+          <w:sz w:val="22"/>
+        </w:rPr>
+        <w:t xml:space="preserve">) acrostic structure, one </w:t>
       </w:r>
       <w:r>
         <w:rPr>
@@ -493,7 +623,27 @@
           <w:color w:val="1A1A1A"/>
           <w:sz w:val="22"/>
         </w:rPr>
-        <w:t xml:space="preserve"> per letter (with the </w:t>
+        <w:t xml:space="preserve"> (</w:t>
+      </w:r>
+      <w:r>
+        <w:rPr>
+          <w:rFonts w:ascii="SBL Hebrew" w:hAnsi="SBL Hebrew" w:cs="SBL Hebrew" w:eastAsia="SBL Hebrew"/>
+          <w:b w:val="0"/>
+          <w:i w:val="0"/>
+          <w:color w:val="1A1A1A"/>
+          <w:sz w:val="22"/>
+        </w:rPr>
+        <w:t>פָּסוּק</w:t>
+      </w:r>
+      <w:r>
+        <w:rPr>
+          <w:rFonts w:ascii="Georgia" w:hAnsi="Georgia" w:cs="SBL Hebrew" w:eastAsia="Georgia"/>
+          <w:b w:val="0"/>
+          <w:i w:val="0"/>
+          <w:color w:val="1A1A1A"/>
+          <w:sz w:val="22"/>
+        </w:rPr>
+        <w:t xml:space="preserve">) per letter (with the </w:t>
       </w:r>
       <w:r>
         <w:rPr>
@@ -647,6 +797,36 @@
       <w:r>
         <w:rPr>
           <w:rFonts w:ascii="Georgia" w:hAnsi="Georgia" w:cs="SBL Hebrew" w:eastAsia="Georgia"/>
+          <w:b w:val="0"/>
+          <w:i w:val="0"/>
+          <w:color w:val="1A1A1A"/>
+          <w:sz w:val="22"/>
+        </w:rPr>
+        <w:t xml:space="preserve"> (</w:t>
+      </w:r>
+      <w:r>
+        <w:rPr>
+          <w:rFonts w:ascii="SBL Hebrew" w:hAnsi="SBL Hebrew" w:cs="SBL Hebrew" w:eastAsia="SBL Hebrew"/>
+          <w:b w:val="0"/>
+          <w:i w:val="0"/>
+          <w:color w:val="1A1A1A"/>
+          <w:sz w:val="22"/>
+        </w:rPr>
+        <w:t>פֶּרֶק חֵלֶק</w:t>
+      </w:r>
+      <w:r>
+        <w:rPr>
+          <w:rFonts w:ascii="Georgia" w:hAnsi="Georgia" w:cs="SBL Hebrew" w:eastAsia="Georgia"/>
+          <w:b w:val="0"/>
+          <w:i w:val="0"/>
+          <w:color w:val="1A1A1A"/>
+          <w:sz w:val="22"/>
+        </w:rPr>
+        <w:t>)</w:t>
+      </w:r>
+      <w:r>
+        <w:rPr>
+          <w:rFonts w:ascii="Georgia" w:hAnsi="Georgia" w:cs="SBL Hebrew" w:eastAsia="Georgia"/>
           <w:color w:val="B8860B"/>
           <w:sz w:val="16"/>
           <w:vertAlign w:val="superscript"/>
@@ -681,7 +861,27 @@
           <w:color w:val="1A1A1A"/>
           <w:sz w:val="22"/>
         </w:rPr>
-        <w:t xml:space="preserve"> in </w:t>
+        <w:t xml:space="preserve"> (</w:t>
+      </w:r>
+      <w:r>
+        <w:rPr>
+          <w:rFonts w:ascii="SBL Hebrew" w:hAnsi="SBL Hebrew" w:cs="SBL Hebrew" w:eastAsia="SBL Hebrew"/>
+          <w:b w:val="0"/>
+          <w:i w:val="0"/>
+          <w:color w:val="1A1A1A"/>
+          <w:sz w:val="22"/>
+        </w:rPr>
+        <w:t>חֵלֶק</w:t>
+      </w:r>
+      <w:r>
+        <w:rPr>
+          <w:rFonts w:ascii="Georgia" w:hAnsi="Georgia" w:cs="SBL Hebrew" w:eastAsia="Georgia"/>
+          <w:b w:val="0"/>
+          <w:i w:val="0"/>
+          <w:color w:val="1A1A1A"/>
+          <w:sz w:val="22"/>
+        </w:rPr>
+        <w:t xml:space="preserve">) in </w:t>
       </w:r>
       <w:r>
         <w:rPr>
@@ -741,7 +941,27 @@
           <w:color w:val="1A1A1A"/>
           <w:sz w:val="22"/>
         </w:rPr>
-        <w:t xml:space="preserve"> resolve the tension by drawing a distinction between two levels of standing. The basic </w:t>
+        <w:t xml:space="preserve"> (</w:t>
+      </w:r>
+      <w:r>
+        <w:rPr>
+          <w:rFonts w:ascii="SBL Hebrew" w:hAnsi="SBL Hebrew" w:cs="SBL Hebrew" w:eastAsia="SBL Hebrew"/>
+          <w:b w:val="0"/>
+          <w:i w:val="0"/>
+          <w:color w:val="1A1A1A"/>
+          <w:sz w:val="22"/>
+        </w:rPr>
+        <w:t>רִאשׁוֹנִים</w:t>
+      </w:r>
+      <w:r>
+        <w:rPr>
+          <w:rFonts w:ascii="Georgia" w:hAnsi="Georgia" w:cs="SBL Hebrew" w:eastAsia="Georgia"/>
+          <w:b w:val="0"/>
+          <w:i w:val="0"/>
+          <w:color w:val="1A1A1A"/>
+          <w:sz w:val="22"/>
+        </w:rPr>
+        <w:t xml:space="preserve">) resolve the tension by drawing a distinction between two levels of standing. The basic </w:t>
       </w:r>
       <w:r>
         <w:rPr>
@@ -781,7 +1001,27 @@
           <w:color w:val="1A1A1A"/>
           <w:sz w:val="22"/>
         </w:rPr>
-        <w:t xml:space="preserve"> can erode it, and grave enough transgression can forfeit it entirely. The status of </w:t>
+        <w:t xml:space="preserve"> (</w:t>
+      </w:r>
+      <w:r>
+        <w:rPr>
+          <w:rFonts w:ascii="SBL Hebrew" w:hAnsi="SBL Hebrew" w:cs="SBL Hebrew" w:eastAsia="SBL Hebrew"/>
+          <w:b w:val="0"/>
+          <w:i w:val="0"/>
+          <w:color w:val="1A1A1A"/>
+          <w:sz w:val="22"/>
+        </w:rPr>
+        <w:t>עֲבֵרוֹת</w:t>
+      </w:r>
+      <w:r>
+        <w:rPr>
+          <w:rFonts w:ascii="Georgia" w:hAnsi="Georgia" w:cs="SBL Hebrew" w:eastAsia="Georgia"/>
+          <w:b w:val="0"/>
+          <w:i w:val="0"/>
+          <w:color w:val="1A1A1A"/>
+          <w:sz w:val="22"/>
+        </w:rPr>
+        <w:t xml:space="preserve">) can erode it, and grave enough transgression can forfeit it entirely. The status of </w:t>
       </w:r>
       <w:r>
         <w:rPr>
@@ -936,7 +1176,27 @@
           <w:color w:val="1A1A1A"/>
           <w:sz w:val="22"/>
         </w:rPr>
-        <w:t xml:space="preserve">: that every mouthful of bread, every breath of air, every unit of sustenance drawn by any living thing, is being handed to it by the Creator in the present instant. This is the root </w:t>
+        <w:t xml:space="preserve"> (</w:t>
+      </w:r>
+      <w:r>
+        <w:rPr>
+          <w:rFonts w:ascii="SBL Hebrew" w:hAnsi="SBL Hebrew" w:cs="SBL Hebrew" w:eastAsia="SBL Hebrew"/>
+          <w:b w:val="0"/>
+          <w:i w:val="0"/>
+          <w:color w:val="1A1A1A"/>
+          <w:sz w:val="22"/>
+        </w:rPr>
+        <w:t>אֱמוּנָה בְּהַשְׁגָּחָה</w:t>
+      </w:r>
+      <w:r>
+        <w:rPr>
+          <w:rFonts w:ascii="Georgia" w:hAnsi="Georgia" w:cs="SBL Hebrew" w:eastAsia="Georgia"/>
+          <w:b w:val="0"/>
+          <w:i w:val="0"/>
+          <w:color w:val="1A1A1A"/>
+          <w:sz w:val="22"/>
+        </w:rPr>
+        <w:t xml:space="preserve">): that every mouthful of bread, every breath of air, every unit of sustenance drawn by any living thing, is being handed to it by the Creator in the present instant. This is the root </w:t>
       </w:r>
       <w:r>
         <w:rPr>
@@ -956,7 +1216,27 @@
           <w:color w:val="1A1A1A"/>
           <w:sz w:val="22"/>
         </w:rPr>
-        <w:t xml:space="preserve"> that all </w:t>
+        <w:t xml:space="preserve"> (</w:t>
+      </w:r>
+      <w:r>
+        <w:rPr>
+          <w:rFonts w:ascii="SBL Hebrew" w:hAnsi="SBL Hebrew" w:cs="SBL Hebrew" w:eastAsia="SBL Hebrew"/>
+          <w:b w:val="0"/>
+          <w:i w:val="0"/>
+          <w:color w:val="1A1A1A"/>
+          <w:sz w:val="22"/>
+        </w:rPr>
+        <w:t>מִדָּה</w:t>
+      </w:r>
+      <w:r>
+        <w:rPr>
+          <w:rFonts w:ascii="Georgia" w:hAnsi="Georgia" w:cs="SBL Hebrew" w:eastAsia="Georgia"/>
+          <w:b w:val="0"/>
+          <w:i w:val="0"/>
+          <w:color w:val="1A1A1A"/>
+          <w:sz w:val="22"/>
+        </w:rPr>
+        <w:t xml:space="preserve">) that all </w:t>
       </w:r>
       <w:r>
         <w:rPr>
@@ -1016,7 +1296,27 @@
           <w:color w:val="1A1A1A"/>
           <w:sz w:val="22"/>
         </w:rPr>
-        <w:t xml:space="preserve"> around the daily truth that it does not. The armor is not magical; it is dispositional. A soul steeped in </w:t>
+        <w:t xml:space="preserve"> (</w:t>
+      </w:r>
+      <w:r>
+        <w:rPr>
+          <w:rFonts w:ascii="SBL Hebrew" w:hAnsi="SBL Hebrew" w:cs="SBL Hebrew" w:eastAsia="SBL Hebrew"/>
+          <w:b w:val="0"/>
+          <w:i w:val="0"/>
+          <w:color w:val="1A1A1A"/>
+          <w:sz w:val="22"/>
+        </w:rPr>
+        <w:t>נֶפֶשׁ</w:t>
+      </w:r>
+      <w:r>
+        <w:rPr>
+          <w:rFonts w:ascii="Georgia" w:hAnsi="Georgia" w:cs="SBL Hebrew" w:eastAsia="Georgia"/>
+          <w:b w:val="0"/>
+          <w:i w:val="0"/>
+          <w:color w:val="1A1A1A"/>
+          <w:sz w:val="22"/>
+        </w:rPr>
+        <w:t xml:space="preserve">) around the daily truth that it does not. The armor is not magical; it is dispositional. A soul steeped in </w:t>
       </w:r>
       <w:r>
         <w:rPr>
@@ -1086,7 +1386,27 @@
           <w:color w:val="1A1A1A"/>
           <w:sz w:val="22"/>
         </w:rPr>
-        <w:t xml:space="preserve"> and </w:t>
+        <w:t xml:space="preserve"> (</w:t>
+      </w:r>
+      <w:r>
+        <w:rPr>
+          <w:rFonts w:ascii="SBL Hebrew" w:hAnsi="SBL Hebrew" w:cs="SBL Hebrew" w:eastAsia="SBL Hebrew"/>
+          <w:b w:val="0"/>
+          <w:i w:val="0"/>
+          <w:color w:val="1A1A1A"/>
+          <w:sz w:val="22"/>
+        </w:rPr>
+        <w:t>רָדָ"ק</w:t>
+      </w:r>
+      <w:r>
+        <w:rPr>
+          <w:rFonts w:ascii="Georgia" w:hAnsi="Georgia" w:cs="SBL Hebrew" w:eastAsia="Georgia"/>
+          <w:b w:val="0"/>
+          <w:i w:val="0"/>
+          <w:color w:val="1A1A1A"/>
+          <w:sz w:val="22"/>
+        </w:rPr>
+        <w:t xml:space="preserve">) and </w:t>
       </w:r>
       <w:r>
         <w:rPr>
@@ -1185,7 +1505,27 @@
           <w:color w:val="1A1A1A"/>
           <w:sz w:val="22"/>
         </w:rPr>
-        <w:t xml:space="preserve"> — on actually hearing the words as one says them. Absent </w:t>
+        <w:t xml:space="preserve"> (</w:t>
+      </w:r>
+      <w:r>
+        <w:rPr>
+          <w:rFonts w:ascii="SBL Hebrew" w:hAnsi="SBL Hebrew" w:cs="SBL Hebrew" w:eastAsia="SBL Hebrew"/>
+          <w:b w:val="0"/>
+          <w:i w:val="0"/>
+          <w:color w:val="1A1A1A"/>
+          <w:sz w:val="22"/>
+        </w:rPr>
+        <w:t>כַּוָּנָה</w:t>
+      </w:r>
+      <w:r>
+        <w:rPr>
+          <w:rFonts w:ascii="Georgia" w:hAnsi="Georgia" w:cs="SBL Hebrew" w:eastAsia="Georgia"/>
+          <w:b w:val="0"/>
+          <w:i w:val="0"/>
+          <w:color w:val="1A1A1A"/>
+          <w:sz w:val="22"/>
+        </w:rPr>
+        <w:t xml:space="preserve">) — on actually hearing the words as one says them. Absent </w:t>
       </w:r>
       <w:r>
         <w:rPr>
@@ -1235,6 +1575,36 @@
       <w:r>
         <w:rPr>
           <w:rFonts w:ascii="Georgia" w:hAnsi="Georgia" w:cs="SBL Hebrew" w:eastAsia="Georgia"/>
+          <w:b w:val="0"/>
+          <w:i w:val="0"/>
+          <w:color w:val="1A1A1A"/>
+          <w:sz w:val="22"/>
+        </w:rPr>
+        <w:t xml:space="preserve"> (</w:t>
+      </w:r>
+      <w:r>
+        <w:rPr>
+          <w:rFonts w:ascii="SBL Hebrew" w:hAnsi="SBL Hebrew" w:cs="SBL Hebrew" w:eastAsia="SBL Hebrew"/>
+          <w:b w:val="0"/>
+          <w:i w:val="0"/>
+          <w:color w:val="1A1A1A"/>
+          <w:sz w:val="22"/>
+        </w:rPr>
+        <w:t>מִשְׁנָה בְּרוּרָה</w:t>
+      </w:r>
+      <w:r>
+        <w:rPr>
+          <w:rFonts w:ascii="Georgia" w:hAnsi="Georgia" w:cs="SBL Hebrew" w:eastAsia="Georgia"/>
+          <w:b w:val="0"/>
+          <w:i w:val="0"/>
+          <w:color w:val="1A1A1A"/>
+          <w:sz w:val="22"/>
+        </w:rPr>
+        <w:t>)</w:t>
+      </w:r>
+      <w:r>
+        <w:rPr>
+          <w:rFonts w:ascii="Georgia" w:hAnsi="Georgia" w:cs="SBL Hebrew" w:eastAsia="Georgia"/>
           <w:color w:val="B8860B"/>
           <w:sz w:val="16"/>
           <w:vertAlign w:val="superscript"/>
@@ -1329,7 +1699,27 @@
           <w:color w:val="1A1A1A"/>
           <w:sz w:val="22"/>
         </w:rPr>
-        <w:t xml:space="preserve"> with proper intent. Even if the recognition comes only after </w:t>
+        <w:t xml:space="preserve"> (</w:t>
+      </w:r>
+      <w:r>
+        <w:rPr>
+          <w:rFonts w:ascii="SBL Hebrew" w:hAnsi="SBL Hebrew" w:cs="SBL Hebrew" w:eastAsia="SBL Hebrew"/>
+          <w:b w:val="0"/>
+          <w:i w:val="0"/>
+          <w:color w:val="1A1A1A"/>
+          <w:sz w:val="22"/>
+        </w:rPr>
+        <w:t>מִזְמוֹר</w:t>
+      </w:r>
+      <w:r>
+        <w:rPr>
+          <w:rFonts w:ascii="Georgia" w:hAnsi="Georgia" w:cs="SBL Hebrew" w:eastAsia="Georgia"/>
+          <w:b w:val="0"/>
+          <w:i w:val="0"/>
+          <w:color w:val="1A1A1A"/>
+          <w:sz w:val="22"/>
+        </w:rPr>
+        <w:t xml:space="preserve">) with proper intent. Even if the recognition comes only after </w:t>
       </w:r>
       <w:r>
         <w:rPr>
@@ -1464,7 +1854,27 @@
           <w:color w:val="1A1A1A"/>
           <w:sz w:val="22"/>
         </w:rPr>
-        <w:t xml:space="preserve"> does not trigger any </w:t>
+        <w:t xml:space="preserve"> (</w:t>
+      </w:r>
+      <w:r>
+        <w:rPr>
+          <w:rFonts w:ascii="SBL Hebrew" w:hAnsi="SBL Hebrew" w:cs="SBL Hebrew" w:eastAsia="SBL Hebrew"/>
+          <w:b w:val="0"/>
+          <w:i w:val="0"/>
+          <w:color w:val="1A1A1A"/>
+          <w:sz w:val="22"/>
+        </w:rPr>
+        <w:t>פְּסוּקֵי דְזִמְרָא</w:t>
+      </w:r>
+      <w:r>
+        <w:rPr>
+          <w:rFonts w:ascii="Georgia" w:hAnsi="Georgia" w:cs="SBL Hebrew" w:eastAsia="Georgia"/>
+          <w:b w:val="0"/>
+          <w:i w:val="0"/>
+          <w:color w:val="1A1A1A"/>
+          <w:sz w:val="22"/>
+        </w:rPr>
+        <w:t xml:space="preserve">) does not trigger any </w:t>
       </w:r>
       <w:r>
         <w:rPr>
@@ -1484,7 +1894,27 @@
           <w:color w:val="1A1A1A"/>
           <w:sz w:val="22"/>
         </w:rPr>
-        <w:t xml:space="preserve">; the return here is unusual. It suggests that </w:t>
+        <w:t xml:space="preserve"> (</w:t>
+      </w:r>
+      <w:r>
+        <w:rPr>
+          <w:rFonts w:ascii="SBL Hebrew" w:hAnsi="SBL Hebrew" w:cs="SBL Hebrew" w:eastAsia="SBL Hebrew"/>
+          <w:b w:val="0"/>
+          <w:i w:val="0"/>
+          <w:color w:val="1A1A1A"/>
+          <w:sz w:val="22"/>
+        </w:rPr>
+        <w:t>חֲזָרָה</w:t>
+      </w:r>
+      <w:r>
+        <w:rPr>
+          <w:rFonts w:ascii="Georgia" w:hAnsi="Georgia" w:cs="SBL Hebrew" w:eastAsia="Georgia"/>
+          <w:b w:val="0"/>
+          <w:i w:val="0"/>
+          <w:color w:val="1A1A1A"/>
+          <w:sz w:val="22"/>
+        </w:rPr>
+        <w:t xml:space="preserve">); the return here is unusual. It suggests that </w:t>
       </w:r>
       <w:r>
         <w:rPr>
@@ -1544,7 +1974,27 @@
           <w:color w:val="1A1A1A"/>
           <w:sz w:val="22"/>
         </w:rPr>
-        <w:t xml:space="preserve"> embedded within </w:t>
+        <w:t xml:space="preserve"> (</w:t>
+      </w:r>
+      <w:r>
+        <w:rPr>
+          <w:rFonts w:ascii="SBL Hebrew" w:hAnsi="SBL Hebrew" w:cs="SBL Hebrew" w:eastAsia="SBL Hebrew"/>
+          <w:b w:val="0"/>
+          <w:i w:val="0"/>
+          <w:color w:val="1A1A1A"/>
+          <w:sz w:val="22"/>
+        </w:rPr>
+        <w:t>קִיּוּם</w:t>
+      </w:r>
+      <w:r>
+        <w:rPr>
+          <w:rFonts w:ascii="Georgia" w:hAnsi="Georgia" w:cs="SBL Hebrew" w:eastAsia="Georgia"/>
+          <w:b w:val="0"/>
+          <w:i w:val="0"/>
+          <w:color w:val="1A1A1A"/>
+          <w:sz w:val="22"/>
+        </w:rPr>
+        <w:t xml:space="preserve">) embedded within </w:t>
       </w:r>
       <w:r>
         <w:rPr>
@@ -1584,7 +2034,27 @@
           <w:color w:val="1A1A1A"/>
           <w:sz w:val="22"/>
         </w:rPr>
-        <w:t xml:space="preserve"> pitched at the level of </w:t>
+        <w:t xml:space="preserve"> (</w:t>
+      </w:r>
+      <w:r>
+        <w:rPr>
+          <w:rFonts w:ascii="SBL Hebrew" w:hAnsi="SBL Hebrew" w:cs="SBL Hebrew" w:eastAsia="SBL Hebrew"/>
+          <w:b w:val="0"/>
+          <w:i w:val="0"/>
+          <w:color w:val="1A1A1A"/>
+          <w:sz w:val="22"/>
+        </w:rPr>
+        <w:t>קַבָּלַת עֹל מַלְכוּת שָׁמַיִם</w:t>
+      </w:r>
+      <w:r>
+        <w:rPr>
+          <w:rFonts w:ascii="Georgia" w:hAnsi="Georgia" w:cs="SBL Hebrew" w:eastAsia="Georgia"/>
+          <w:b w:val="0"/>
+          <w:i w:val="0"/>
+          <w:color w:val="1A1A1A"/>
+          <w:sz w:val="22"/>
+        </w:rPr>
+        <w:t xml:space="preserve">) pitched at the level of </w:t>
       </w:r>
       <w:r>
         <w:rPr>
@@ -1759,7 +2229,27 @@
           <w:color w:val="1A1A1A"/>
           <w:sz w:val="22"/>
         </w:rPr>
-        <w:t xml:space="preserve"> for the </w:t>
+        <w:t xml:space="preserve"> (</w:t>
+      </w:r>
+      <w:r>
+        <w:rPr>
+          <w:rFonts w:ascii="SBL Hebrew" w:hAnsi="SBL Hebrew" w:cs="SBL Hebrew" w:eastAsia="SBL Hebrew"/>
+          <w:b w:val="0"/>
+          <w:i w:val="0"/>
+          <w:color w:val="1A1A1A"/>
+          <w:sz w:val="22"/>
+        </w:rPr>
+        <w:t>כְּלִי קִבּוּל</w:t>
+      </w:r>
+      <w:r>
+        <w:rPr>
+          <w:rFonts w:ascii="Georgia" w:hAnsi="Georgia" w:cs="SBL Hebrew" w:eastAsia="Georgia"/>
+          <w:b w:val="0"/>
+          <w:i w:val="0"/>
+          <w:color w:val="1A1A1A"/>
+          <w:sz w:val="22"/>
+        </w:rPr>
+        <w:t xml:space="preserve">) for the </w:t>
       </w:r>
       <w:r>
         <w:rPr>
@@ -1779,7 +2269,27 @@
           <w:color w:val="1A1A1A"/>
           <w:sz w:val="22"/>
         </w:rPr>
-        <w:t xml:space="preserve"> that the verse describes.</w:t>
+        <w:t xml:space="preserve"> (</w:t>
+      </w:r>
+      <w:r>
+        <w:rPr>
+          <w:rFonts w:ascii="SBL Hebrew" w:hAnsi="SBL Hebrew" w:cs="SBL Hebrew" w:eastAsia="SBL Hebrew"/>
+          <w:b w:val="0"/>
+          <w:i w:val="0"/>
+          <w:color w:val="1A1A1A"/>
+          <w:sz w:val="22"/>
+        </w:rPr>
+        <w:t>שֶׁפַע</w:t>
+      </w:r>
+      <w:r>
+        <w:rPr>
+          <w:rFonts w:ascii="Georgia" w:hAnsi="Georgia" w:cs="SBL Hebrew" w:eastAsia="Georgia"/>
+          <w:b w:val="0"/>
+          <w:i w:val="0"/>
+          <w:color w:val="1A1A1A"/>
+          <w:sz w:val="22"/>
+        </w:rPr>
+        <w:t>) that the verse describes.</w:t>
       </w:r>
     </w:p>
     <w:p>
@@ -1872,7 +2382,27 @@
           <w:color w:val="1A1A1A"/>
           <w:sz w:val="22"/>
         </w:rPr>
-        <w:t xml:space="preserve">, one recitation corresponding to each of the day’s three prayers. This immediately raises a puzzle from settled practice. In the received </w:t>
+        <w:t xml:space="preserve"> (</w:t>
+      </w:r>
+      <w:r>
+        <w:rPr>
+          <w:rFonts w:ascii="SBL Hebrew" w:hAnsi="SBL Hebrew" w:cs="SBL Hebrew" w:eastAsia="SBL Hebrew"/>
+          <w:b w:val="0"/>
+          <w:i w:val="0"/>
+          <w:color w:val="1A1A1A"/>
+          <w:sz w:val="22"/>
+        </w:rPr>
+        <w:t>כְּנֶגֶד שָׁלֹשׁ תְּפִלּוֹת</w:t>
+      </w:r>
+      <w:r>
+        <w:rPr>
+          <w:rFonts w:ascii="Georgia" w:hAnsi="Georgia" w:cs="SBL Hebrew" w:eastAsia="Georgia"/>
+          <w:b w:val="0"/>
+          <w:i w:val="0"/>
+          <w:color w:val="1A1A1A"/>
+          <w:sz w:val="22"/>
+        </w:rPr>
+        <w:t xml:space="preserve">), one recitation corresponding to each of the day’s three prayers. This immediately raises a puzzle from settled practice. In the received </w:t>
       </w:r>
       <w:r>
         <w:rPr>
@@ -1932,7 +2462,27 @@
           <w:color w:val="1A1A1A"/>
           <w:sz w:val="22"/>
         </w:rPr>
-        <w:t xml:space="preserve"> — once in </w:t>
+        <w:t xml:space="preserve"> (</w:t>
+      </w:r>
+      <w:r>
+        <w:rPr>
+          <w:rFonts w:ascii="SBL Hebrew" w:hAnsi="SBL Hebrew" w:cs="SBL Hebrew" w:eastAsia="SBL Hebrew"/>
+          <w:b w:val="0"/>
+          <w:i w:val="0"/>
+          <w:color w:val="1A1A1A"/>
+          <w:sz w:val="22"/>
+        </w:rPr>
+        <w:t>שַׁחֲרִית</w:t>
+      </w:r>
+      <w:r>
+        <w:rPr>
+          <w:rFonts w:ascii="Georgia" w:hAnsi="Georgia" w:cs="SBL Hebrew" w:eastAsia="Georgia"/>
+          <w:b w:val="0"/>
+          <w:i w:val="0"/>
+          <w:color w:val="1A1A1A"/>
+          <w:sz w:val="22"/>
+        </w:rPr>
+        <w:t xml:space="preserve">) — once in </w:t>
       </w:r>
       <w:r>
         <w:rPr>
@@ -1992,7 +2542,27 @@
           <w:color w:val="1A1A1A"/>
           <w:sz w:val="22"/>
         </w:rPr>
-        <w:t xml:space="preserve">, but never in </w:t>
+        <w:t xml:space="preserve"> (</w:t>
+      </w:r>
+      <w:r>
+        <w:rPr>
+          <w:rFonts w:ascii="SBL Hebrew" w:hAnsi="SBL Hebrew" w:cs="SBL Hebrew" w:eastAsia="SBL Hebrew"/>
+          <w:b w:val="0"/>
+          <w:i w:val="0"/>
+          <w:color w:val="1A1A1A"/>
+          <w:sz w:val="22"/>
+        </w:rPr>
+        <w:t>מִנְחָה</w:t>
+      </w:r>
+      <w:r>
+        <w:rPr>
+          <w:rFonts w:ascii="Georgia" w:hAnsi="Georgia" w:cs="SBL Hebrew" w:eastAsia="Georgia"/>
+          <w:b w:val="0"/>
+          <w:i w:val="0"/>
+          <w:color w:val="1A1A1A"/>
+          <w:sz w:val="22"/>
+        </w:rPr>
+        <w:t xml:space="preserve">), but never in </w:t>
       </w:r>
       <w:r>
         <w:rPr>
@@ -2012,7 +2582,27 @@
           <w:color w:val="1A1A1A"/>
           <w:sz w:val="22"/>
         </w:rPr>
-        <w:t xml:space="preserve">. If the count is one per </w:t>
+        <w:t xml:space="preserve"> (</w:t>
+      </w:r>
+      <w:r>
+        <w:rPr>
+          <w:rFonts w:ascii="SBL Hebrew" w:hAnsi="SBL Hebrew" w:cs="SBL Hebrew" w:eastAsia="SBL Hebrew"/>
+          <w:b w:val="0"/>
+          <w:i w:val="0"/>
+          <w:color w:val="1A1A1A"/>
+          <w:sz w:val="22"/>
+        </w:rPr>
+        <w:t>מַעֲרִיב</w:t>
+      </w:r>
+      <w:r>
+        <w:rPr>
+          <w:rFonts w:ascii="Georgia" w:hAnsi="Georgia" w:cs="SBL Hebrew" w:eastAsia="Georgia"/>
+          <w:b w:val="0"/>
+          <w:i w:val="0"/>
+          <w:color w:val="1A1A1A"/>
+          <w:sz w:val="22"/>
+        </w:rPr>
+        <w:t xml:space="preserve">). If the count is one per </w:t>
       </w:r>
       <w:r>
         <w:rPr>
@@ -2206,7 +2796,27 @@
           <w:color w:val="1A1A1A"/>
           <w:sz w:val="22"/>
         </w:rPr>
-        <w:t xml:space="preserve"> — optional — and many did not </w:t>
+        <w:t xml:space="preserve"> (</w:t>
+      </w:r>
+      <w:r>
+        <w:rPr>
+          <w:rFonts w:ascii="SBL Hebrew" w:hAnsi="SBL Hebrew" w:cs="SBL Hebrew" w:eastAsia="SBL Hebrew"/>
+          <w:b w:val="0"/>
+          <w:i w:val="0"/>
+          <w:color w:val="1A1A1A"/>
+          <w:sz w:val="22"/>
+        </w:rPr>
+        <w:t>רְשׁוּת</w:t>
+      </w:r>
+      <w:r>
+        <w:rPr>
+          <w:rFonts w:ascii="Georgia" w:hAnsi="Georgia" w:cs="SBL Hebrew" w:eastAsia="Georgia"/>
+          <w:b w:val="0"/>
+          <w:i w:val="0"/>
+          <w:color w:val="1A1A1A"/>
+          <w:sz w:val="22"/>
+        </w:rPr>
+        <w:t xml:space="preserve">) — optional — and many did not </w:t>
       </w:r>
       <w:r>
         <w:rPr>
@@ -2366,7 +2976,27 @@
           <w:color w:val="1A1A1A"/>
           <w:sz w:val="22"/>
         </w:rPr>
-        <w:t xml:space="preserve">, but the earlier arrangement of the </w:t>
+        <w:t xml:space="preserve"> (</w:t>
+      </w:r>
+      <w:r>
+        <w:rPr>
+          <w:rFonts w:ascii="SBL Hebrew" w:hAnsi="SBL Hebrew" w:cs="SBL Hebrew" w:eastAsia="SBL Hebrew"/>
+          <w:b w:val="0"/>
+          <w:i w:val="0"/>
+          <w:color w:val="1A1A1A"/>
+          <w:sz w:val="22"/>
+        </w:rPr>
+        <w:t>חוֹבָה</w:t>
+      </w:r>
+      <w:r>
+        <w:rPr>
+          <w:rFonts w:ascii="Georgia" w:hAnsi="Georgia" w:cs="SBL Hebrew" w:eastAsia="Georgia"/>
+          <w:b w:val="0"/>
+          <w:i w:val="0"/>
+          <w:color w:val="1A1A1A"/>
+          <w:sz w:val="22"/>
+        </w:rPr>
+        <w:t xml:space="preserve">), but the earlier arrangement of the </w:t>
       </w:r>
       <w:r>
         <w:rPr>
@@ -2406,7 +3036,27 @@
           <w:color w:val="1A1A1A"/>
           <w:sz w:val="22"/>
         </w:rPr>
-        <w:t xml:space="preserve"> and was preserved.</w:t>
+        <w:t xml:space="preserve"> (</w:t>
+      </w:r>
+      <w:r>
+        <w:rPr>
+          <w:rFonts w:ascii="SBL Hebrew" w:hAnsi="SBL Hebrew" w:cs="SBL Hebrew" w:eastAsia="SBL Hebrew"/>
+          <w:b w:val="0"/>
+          <w:i w:val="0"/>
+          <w:color w:val="1A1A1A"/>
+          <w:sz w:val="22"/>
+        </w:rPr>
+        <w:t>מִנְהַג יִשְׂרָאֵל</w:t>
+      </w:r>
+      <w:r>
+        <w:rPr>
+          <w:rFonts w:ascii="Georgia" w:hAnsi="Georgia" w:cs="SBL Hebrew" w:eastAsia="Georgia"/>
+          <w:b w:val="0"/>
+          <w:i w:val="0"/>
+          <w:color w:val="1A1A1A"/>
+          <w:sz w:val="22"/>
+        </w:rPr>
+        <w:t>) and was preserved.</w:t>
       </w:r>
     </w:p>
     <w:p>
@@ -2525,7 +3175,27 @@
           <w:color w:val="1A1A1A"/>
           <w:sz w:val="22"/>
         </w:rPr>
-        <w:t xml:space="preserve"> of the </w:t>
+        <w:t xml:space="preserve"> (</w:t>
+      </w:r>
+      <w:r>
+        <w:rPr>
+          <w:rFonts w:ascii="SBL Hebrew" w:hAnsi="SBL Hebrew" w:cs="SBL Hebrew" w:eastAsia="SBL Hebrew"/>
+          <w:b w:val="0"/>
+          <w:i w:val="0"/>
+          <w:color w:val="1A1A1A"/>
+          <w:sz w:val="22"/>
+        </w:rPr>
+        <w:t>גִּרְסָא</w:t>
+      </w:r>
+      <w:r>
+        <w:rPr>
+          <w:rFonts w:ascii="Georgia" w:hAnsi="Georgia" w:cs="SBL Hebrew" w:eastAsia="Georgia"/>
+          <w:b w:val="0"/>
+          <w:i w:val="0"/>
+          <w:color w:val="1A1A1A"/>
+          <w:sz w:val="22"/>
+        </w:rPr>
+        <w:t xml:space="preserve">) of the </w:t>
       </w:r>
       <w:r>
         <w:rPr>
@@ -2625,7 +3295,27 @@
           <w:color w:val="1A1A1A"/>
           <w:sz w:val="22"/>
         </w:rPr>
-        <w:t xml:space="preserve"> is not trivial. If three are a margin, a Jew confident of hitting one with </w:t>
+        <w:t xml:space="preserve"> (</w:t>
+      </w:r>
+      <w:r>
+        <w:rPr>
+          <w:rFonts w:ascii="SBL Hebrew" w:hAnsi="SBL Hebrew" w:cs="SBL Hebrew" w:eastAsia="SBL Hebrew"/>
+          <w:b w:val="0"/>
+          <w:i w:val="0"/>
+          <w:color w:val="1A1A1A"/>
+          <w:sz w:val="22"/>
+        </w:rPr>
+        <w:t>נַפְקָא מִינַהּ</w:t>
+      </w:r>
+      <w:r>
+        <w:rPr>
+          <w:rFonts w:ascii="Georgia" w:hAnsi="Georgia" w:cs="SBL Hebrew" w:eastAsia="Georgia"/>
+          <w:b w:val="0"/>
+          <w:i w:val="0"/>
+          <w:color w:val="1A1A1A"/>
+          <w:sz w:val="22"/>
+        </w:rPr>
+        <w:t xml:space="preserve">) is not trivial. If three are a margin, a Jew confident of hitting one with </w:t>
       </w:r>
       <w:r>
         <w:rPr>
@@ -2894,7 +3584,27 @@
           <w:color w:val="1A1A1A"/>
           <w:sz w:val="22"/>
         </w:rPr>
-        <w:t xml:space="preserve">. The </w:t>
+        <w:t xml:space="preserve"> (</w:t>
+      </w:r>
+      <w:r>
+        <w:rPr>
+          <w:rFonts w:ascii="SBL Hebrew" w:hAnsi="SBL Hebrew" w:cs="SBL Hebrew" w:eastAsia="SBL Hebrew"/>
+          <w:b w:val="0"/>
+          <w:i w:val="0"/>
+          <w:color w:val="1A1A1A"/>
+          <w:sz w:val="22"/>
+        </w:rPr>
+        <w:t>אֲרוֹמִמְךָ אֱלוֹקַי הַמֶּלֶךְ</w:t>
+      </w:r>
+      <w:r>
+        <w:rPr>
+          <w:rFonts w:ascii="Georgia" w:hAnsi="Georgia" w:cs="SBL Hebrew" w:eastAsia="Georgia"/>
+          <w:b w:val="0"/>
+          <w:i w:val="0"/>
+          <w:color w:val="1A1A1A"/>
+          <w:sz w:val="22"/>
+        </w:rPr>
+        <w:t xml:space="preserve">). The </w:t>
       </w:r>
       <w:r>
         <w:rPr>
@@ -2914,7 +3624,27 @@
           <w:color w:val="1A1A1A"/>
           <w:sz w:val="22"/>
         </w:rPr>
-        <w:t>, however, prepends two verses drawn from elsewhere. Their placement is neither accidental nor merely aesthetic.</w:t>
+        <w:t xml:space="preserve"> (</w:t>
+      </w:r>
+      <w:r>
+        <w:rPr>
+          <w:rFonts w:ascii="SBL Hebrew" w:hAnsi="SBL Hebrew" w:cs="SBL Hebrew" w:eastAsia="SBL Hebrew"/>
+          <w:b w:val="0"/>
+          <w:i w:val="0"/>
+          <w:color w:val="1A1A1A"/>
+          <w:sz w:val="22"/>
+        </w:rPr>
+        <w:t>סִדּוּר</w:t>
+      </w:r>
+      <w:r>
+        <w:rPr>
+          <w:rFonts w:ascii="Georgia" w:hAnsi="Georgia" w:cs="SBL Hebrew" w:eastAsia="Georgia"/>
+          <w:b w:val="0"/>
+          <w:i w:val="0"/>
+          <w:color w:val="1A1A1A"/>
+          <w:sz w:val="22"/>
+        </w:rPr>
+        <w:t>), however, prepends two verses drawn from elsewhere. Their placement is neither accidental nor merely aesthetic.</w:t>
       </w:r>
     </w:p>
     <w:p>
@@ -3097,7 +3827,27 @@
           <w:color w:val="1A1A1A"/>
           <w:sz w:val="22"/>
         </w:rPr>
-        <w:t xml:space="preserve"> — wait a full hour before </w:t>
+        <w:t xml:space="preserve"> (</w:t>
+      </w:r>
+      <w:r>
+        <w:rPr>
+          <w:rFonts w:ascii="SBL Hebrew" w:hAnsi="SBL Hebrew" w:cs="SBL Hebrew" w:eastAsia="SBL Hebrew"/>
+          <w:b w:val="0"/>
+          <w:i w:val="0"/>
+          <w:color w:val="1A1A1A"/>
+          <w:sz w:val="22"/>
+        </w:rPr>
+        <w:t>שׁוֹהִין שָׁעָה אַחַת</w:t>
+      </w:r>
+      <w:r>
+        <w:rPr>
+          <w:rFonts w:ascii="Georgia" w:hAnsi="Georgia" w:cs="SBL Hebrew" w:eastAsia="Georgia"/>
+          <w:b w:val="0"/>
+          <w:i w:val="0"/>
+          <w:color w:val="1A1A1A"/>
+          <w:sz w:val="22"/>
+        </w:rPr>
+        <w:t xml:space="preserve">) — wait a full hour before </w:t>
       </w:r>
       <w:r>
         <w:rPr>
@@ -3177,7 +3927,27 @@
           <w:color w:val="1A1A1A"/>
           <w:sz w:val="22"/>
         </w:rPr>
-        <w:t xml:space="preserve"> at large: a structured span of preparation preceding the </w:t>
+        <w:t xml:space="preserve"> (</w:t>
+      </w:r>
+      <w:r>
+        <w:rPr>
+          <w:rFonts w:ascii="SBL Hebrew" w:hAnsi="SBL Hebrew" w:cs="SBL Hebrew" w:eastAsia="SBL Hebrew"/>
+          <w:b w:val="0"/>
+          <w:i w:val="0"/>
+          <w:color w:val="1A1A1A"/>
+          <w:sz w:val="22"/>
+        </w:rPr>
+        <w:t>כְּלַל יִשְׂרָאֵל</w:t>
+      </w:r>
+      <w:r>
+        <w:rPr>
+          <w:rFonts w:ascii="Georgia" w:hAnsi="Georgia" w:cs="SBL Hebrew" w:eastAsia="Georgia"/>
+          <w:b w:val="0"/>
+          <w:i w:val="0"/>
+          <w:color w:val="1A1A1A"/>
+          <w:sz w:val="22"/>
+        </w:rPr>
+        <w:t xml:space="preserve">) at large: a structured span of preparation preceding the </w:t>
       </w:r>
       <w:r>
         <w:rPr>
@@ -3197,7 +3967,27 @@
           <w:color w:val="1A1A1A"/>
           <w:sz w:val="22"/>
         </w:rPr>
-        <w:t xml:space="preserve">. It is therefore precisely fitting that the central </w:t>
+        <w:t xml:space="preserve"> (</w:t>
+      </w:r>
+      <w:r>
+        <w:rPr>
+          <w:rFonts w:ascii="SBL Hebrew" w:hAnsi="SBL Hebrew" w:cs="SBL Hebrew" w:eastAsia="SBL Hebrew"/>
+          <w:b w:val="0"/>
+          <w:i w:val="0"/>
+          <w:color w:val="1A1A1A"/>
+          <w:sz w:val="22"/>
+        </w:rPr>
+        <w:t>שְׁמוֹנֶה עֶשְׂרֵה</w:t>
+      </w:r>
+      <w:r>
+        <w:rPr>
+          <w:rFonts w:ascii="Georgia" w:hAnsi="Georgia" w:cs="SBL Hebrew" w:eastAsia="Georgia"/>
+          <w:b w:val="0"/>
+          <w:i w:val="0"/>
+          <w:color w:val="1A1A1A"/>
+          <w:sz w:val="22"/>
+        </w:rPr>
+        <w:t xml:space="preserve">). It is therefore precisely fitting that the central </w:t>
       </w:r>
       <w:r>
         <w:rPr>
@@ -3412,7 +4202,27 @@
           <w:color w:val="1A1A1A"/>
           <w:sz w:val="22"/>
         </w:rPr>
-        <w:t xml:space="preserve">. The verse contains the word </w:t>
+        <w:t xml:space="preserve"> (</w:t>
+      </w:r>
+      <w:r>
+        <w:rPr>
+          <w:rFonts w:ascii="SBL Hebrew" w:hAnsi="SBL Hebrew" w:cs="SBL Hebrew" w:eastAsia="SBL Hebrew"/>
+          <w:b w:val="0"/>
+          <w:i w:val="0"/>
+          <w:color w:val="1A1A1A"/>
+          <w:sz w:val="22"/>
+        </w:rPr>
+        <w:t>רֶמֶז</w:t>
+      </w:r>
+      <w:r>
+        <w:rPr>
+          <w:rFonts w:ascii="Georgia" w:hAnsi="Georgia" w:cs="SBL Hebrew" w:eastAsia="Georgia"/>
+          <w:b w:val="0"/>
+          <w:i w:val="0"/>
+          <w:color w:val="1A1A1A"/>
+          <w:sz w:val="22"/>
+        </w:rPr>
+        <w:t xml:space="preserve">). The verse contains the word </w:t>
       </w:r>
       <w:r>
         <w:rPr>
@@ -3522,6 +4332,36 @@
       <w:r>
         <w:rPr>
           <w:rFonts w:ascii="Georgia" w:hAnsi="Georgia" w:cs="SBL Hebrew" w:eastAsia="Georgia"/>
+          <w:b w:val="0"/>
+          <w:i w:val="0"/>
+          <w:color w:val="1A1A1A"/>
+          <w:sz w:val="22"/>
+        </w:rPr>
+        <w:t xml:space="preserve"> (</w:t>
+      </w:r>
+      <w:r>
+        <w:rPr>
+          <w:rFonts w:ascii="SBL Hebrew" w:hAnsi="SBL Hebrew" w:cs="SBL Hebrew" w:eastAsia="SBL Hebrew"/>
+          <w:b w:val="0"/>
+          <w:i w:val="0"/>
+          <w:color w:val="1A1A1A"/>
+          <w:sz w:val="22"/>
+        </w:rPr>
+        <w:t>מַהֲרְשַׁ"ל</w:t>
+      </w:r>
+      <w:r>
+        <w:rPr>
+          <w:rFonts w:ascii="Georgia" w:hAnsi="Georgia" w:cs="SBL Hebrew" w:eastAsia="Georgia"/>
+          <w:b w:val="0"/>
+          <w:i w:val="0"/>
+          <w:color w:val="1A1A1A"/>
+          <w:sz w:val="22"/>
+        </w:rPr>
+        <w:t>)</w:t>
+      </w:r>
+      <w:r>
+        <w:rPr>
+          <w:rFonts w:ascii="Georgia" w:hAnsi="Georgia" w:cs="SBL Hebrew" w:eastAsia="Georgia"/>
           <w:color w:val="B8860B"/>
           <w:sz w:val="16"/>
           <w:vertAlign w:val="superscript"/>
@@ -3556,7 +4396,27 @@
           <w:color w:val="1A1A1A"/>
           <w:sz w:val="22"/>
         </w:rPr>
-        <w:t xml:space="preserve"> in holding that </w:t>
+        <w:t xml:space="preserve"> (</w:t>
+      </w:r>
+      <w:r>
+        <w:rPr>
+          <w:rFonts w:ascii="SBL Hebrew" w:hAnsi="SBL Hebrew" w:cs="SBL Hebrew" w:eastAsia="SBL Hebrew"/>
+          <w:b w:val="0"/>
+          <w:i w:val="0"/>
+          <w:color w:val="1A1A1A"/>
+          <w:sz w:val="22"/>
+        </w:rPr>
+        <w:t>אַחֲרוֹנִים</w:t>
+      </w:r>
+      <w:r>
+        <w:rPr>
+          <w:rFonts w:ascii="Georgia" w:hAnsi="Georgia" w:cs="SBL Hebrew" w:eastAsia="Georgia"/>
+          <w:b w:val="0"/>
+          <w:i w:val="0"/>
+          <w:color w:val="1A1A1A"/>
+          <w:sz w:val="22"/>
+        </w:rPr>
+        <w:t xml:space="preserve">) in holding that </w:t>
       </w:r>
       <w:r>
         <w:rPr>
@@ -3656,7 +4516,27 @@
           <w:color w:val="1A1A1A"/>
           <w:sz w:val="22"/>
         </w:rPr>
-        <w:t xml:space="preserve"> in the historical record, without practical consequence for the received order.</w:t>
+        <w:t xml:space="preserve"> (</w:t>
+      </w:r>
+      <w:r>
+        <w:rPr>
+          <w:rFonts w:ascii="SBL Hebrew" w:hAnsi="SBL Hebrew" w:cs="SBL Hebrew" w:eastAsia="SBL Hebrew"/>
+          <w:b w:val="0"/>
+          <w:i w:val="0"/>
+          <w:color w:val="1A1A1A"/>
+          <w:sz w:val="22"/>
+        </w:rPr>
+        <w:t>נֻסָּח</w:t>
+      </w:r>
+      <w:r>
+        <w:rPr>
+          <w:rFonts w:ascii="Georgia" w:hAnsi="Georgia" w:cs="SBL Hebrew" w:eastAsia="Georgia"/>
+          <w:b w:val="0"/>
+          <w:i w:val="0"/>
+          <w:color w:val="1A1A1A"/>
+          <w:sz w:val="22"/>
+        </w:rPr>
+        <w:t>) in the historical record, without practical consequence for the received order.</w:t>
       </w:r>
     </w:p>
     <w:p>
@@ -3726,7 +4606,27 @@
           <w:color w:val="1A1A1A"/>
           <w:sz w:val="22"/>
         </w:rPr>
-        <w:t xml:space="preserve">, by </w:t>
+        <w:t xml:space="preserve"> (</w:t>
+      </w:r>
+      <w:r>
+        <w:rPr>
+          <w:rFonts w:ascii="SBL Hebrew" w:hAnsi="SBL Hebrew" w:cs="SBL Hebrew" w:eastAsia="SBL Hebrew"/>
+          <w:b w:val="0"/>
+          <w:i w:val="0"/>
+          <w:color w:val="1A1A1A"/>
+          <w:sz w:val="22"/>
+        </w:rPr>
+        <w:t>דָּוִד הַמֶּלֶךְ</w:t>
+      </w:r>
+      <w:r>
+        <w:rPr>
+          <w:rFonts w:ascii="Georgia" w:hAnsi="Georgia" w:cs="SBL Hebrew" w:eastAsia="Georgia"/>
+          <w:b w:val="0"/>
+          <w:i w:val="0"/>
+          <w:color w:val="1A1A1A"/>
+          <w:sz w:val="22"/>
+        </w:rPr>
+        <w:t xml:space="preserve">), by </w:t>
       </w:r>
       <w:r>
         <w:rPr>
@@ -3746,7 +4646,27 @@
           <w:color w:val="1A1A1A"/>
           <w:sz w:val="22"/>
         </w:rPr>
-        <w:t xml:space="preserve">, omitted the letter </w:t>
+        <w:t xml:space="preserve"> (</w:t>
+      </w:r>
+      <w:r>
+        <w:rPr>
+          <w:rFonts w:ascii="SBL Hebrew" w:hAnsi="SBL Hebrew" w:cs="SBL Hebrew" w:eastAsia="SBL Hebrew"/>
+          <w:b w:val="0"/>
+          <w:i w:val="0"/>
+          <w:color w:val="1A1A1A"/>
+          <w:sz w:val="22"/>
+        </w:rPr>
+        <w:t>רוּחַ הַקֹּדֶשׁ</w:t>
+      </w:r>
+      <w:r>
+        <w:rPr>
+          <w:rFonts w:ascii="Georgia" w:hAnsi="Georgia" w:cs="SBL Hebrew" w:eastAsia="Georgia"/>
+          <w:b w:val="0"/>
+          <w:i w:val="0"/>
+          <w:color w:val="1A1A1A"/>
+          <w:sz w:val="22"/>
+        </w:rPr>
+        <w:t xml:space="preserve">), omitted the letter </w:t>
       </w:r>
       <w:r>
         <w:rPr>
@@ -3806,7 +4726,27 @@
           <w:color w:val="1A1A1A"/>
           <w:sz w:val="22"/>
         </w:rPr>
-        <w:t xml:space="preserve"> — falling — and specifically with the verse in </w:t>
+        <w:t xml:space="preserve"> (</w:t>
+      </w:r>
+      <w:r>
+        <w:rPr>
+          <w:rFonts w:ascii="SBL Hebrew" w:hAnsi="SBL Hebrew" w:cs="SBL Hebrew" w:eastAsia="SBL Hebrew"/>
+          <w:b w:val="0"/>
+          <w:i w:val="0"/>
+          <w:color w:val="1A1A1A"/>
+          <w:sz w:val="22"/>
+        </w:rPr>
+        <w:t>נְפִילָה</w:t>
+      </w:r>
+      <w:r>
+        <w:rPr>
+          <w:rFonts w:ascii="Georgia" w:hAnsi="Georgia" w:cs="SBL Hebrew" w:eastAsia="Georgia"/>
+          <w:b w:val="0"/>
+          <w:i w:val="0"/>
+          <w:color w:val="1A1A1A"/>
+          <w:sz w:val="22"/>
+        </w:rPr>
+        <w:t xml:space="preserve">) — falling — and specifically with the verse in </w:t>
       </w:r>
       <w:r>
         <w:rPr>
@@ -3826,7 +4766,27 @@
           <w:color w:val="1A1A1A"/>
           <w:sz w:val="22"/>
         </w:rPr>
-        <w:t>:</w:t>
+        <w:t xml:space="preserve"> (</w:t>
+      </w:r>
+      <w:r>
+        <w:rPr>
+          <w:rFonts w:ascii="SBL Hebrew" w:hAnsi="SBL Hebrew" w:cs="SBL Hebrew" w:eastAsia="SBL Hebrew"/>
+          <w:b w:val="0"/>
+          <w:i w:val="0"/>
+          <w:color w:val="1A1A1A"/>
+          <w:sz w:val="22"/>
+        </w:rPr>
+        <w:t>עָמוֹס</w:t>
+      </w:r>
+      <w:r>
+        <w:rPr>
+          <w:rFonts w:ascii="Georgia" w:hAnsi="Georgia" w:cs="SBL Hebrew" w:eastAsia="Georgia"/>
+          <w:b w:val="0"/>
+          <w:i w:val="0"/>
+          <w:color w:val="1A1A1A"/>
+          <w:sz w:val="22"/>
+        </w:rPr>
+        <w:t>):</w:t>
       </w:r>
       <w:r>
         <w:rPr>
@@ -3990,7 +4950,27 @@
           <w:color w:val="1A1A1A"/>
           <w:sz w:val="22"/>
         </w:rPr>
-        <w:t xml:space="preserve"> observe that the verse itself admits a softer punctuation — </w:t>
+        <w:t xml:space="preserve"> (</w:t>
+      </w:r>
+      <w:r>
+        <w:rPr>
+          <w:rFonts w:ascii="SBL Hebrew" w:hAnsi="SBL Hebrew" w:cs="SBL Hebrew" w:eastAsia="SBL Hebrew"/>
+          <w:b w:val="0"/>
+          <w:i w:val="0"/>
+          <w:color w:val="1A1A1A"/>
+          <w:sz w:val="22"/>
+        </w:rPr>
+        <w:t>מְפָרְשִׁים</w:t>
+      </w:r>
+      <w:r>
+        <w:rPr>
+          <w:rFonts w:ascii="Georgia" w:hAnsi="Georgia" w:cs="SBL Hebrew" w:eastAsia="Georgia"/>
+          <w:b w:val="0"/>
+          <w:i w:val="0"/>
+          <w:color w:val="1A1A1A"/>
+          <w:sz w:val="22"/>
+        </w:rPr>
+        <w:t xml:space="preserve">) observe that the verse itself admits a softer punctuation — </w:t>
       </w:r>
       <w:r>
         <w:rPr>
@@ -4105,7 +5085,27 @@
           <w:color w:val="1A1A1A"/>
           <w:sz w:val="22"/>
         </w:rPr>
-        <w:t xml:space="preserve">, does not evade </w:t>
+        <w:t xml:space="preserve"> (</w:t>
+      </w:r>
+      <w:r>
+        <w:rPr>
+          <w:rFonts w:ascii="SBL Hebrew" w:hAnsi="SBL Hebrew" w:cs="SBL Hebrew" w:eastAsia="SBL Hebrew"/>
+          <w:b w:val="0"/>
+          <w:i w:val="0"/>
+          <w:color w:val="1A1A1A"/>
+          <w:sz w:val="22"/>
+        </w:rPr>
+        <w:t>סָמֶ"ךְ</w:t>
+      </w:r>
+      <w:r>
+        <w:rPr>
+          <w:rFonts w:ascii="Georgia" w:hAnsi="Georgia" w:cs="SBL Hebrew" w:eastAsia="Georgia"/>
+          <w:b w:val="0"/>
+          <w:i w:val="0"/>
+          <w:color w:val="1A1A1A"/>
+          <w:sz w:val="22"/>
+        </w:rPr>
+        <w:t xml:space="preserve">), does not evade </w:t>
       </w:r>
       <w:r>
         <w:rPr>
@@ -4369,7 +5369,27 @@
           <w:color w:val="1A1A1A"/>
           <w:sz w:val="22"/>
         </w:rPr>
-        <w:t>, the received text appends a further verse:</w:t>
+        <w:t xml:space="preserve"> (</w:t>
+      </w:r>
+      <w:r>
+        <w:rPr>
+          <w:rFonts w:ascii="SBL Hebrew" w:hAnsi="SBL Hebrew" w:cs="SBL Hebrew" w:eastAsia="SBL Hebrew"/>
+          <w:b w:val="0"/>
+          <w:i w:val="0"/>
+          <w:color w:val="1A1A1A"/>
+          <w:sz w:val="22"/>
+        </w:rPr>
+        <w:t>תָּי"ו</w:t>
+      </w:r>
+      <w:r>
+        <w:rPr>
+          <w:rFonts w:ascii="Georgia" w:hAnsi="Georgia" w:cs="SBL Hebrew" w:eastAsia="Georgia"/>
+          <w:b w:val="0"/>
+          <w:i w:val="0"/>
+          <w:color w:val="1A1A1A"/>
+          <w:sz w:val="22"/>
+        </w:rPr>
+        <w:t>), the received text appends a further verse:</w:t>
       </w:r>
       <w:r>
         <w:rPr>
@@ -4758,7 +5778,27 @@
           <w:color w:val="1A1A1A"/>
           <w:sz w:val="22"/>
         </w:rPr>
-        <w:t xml:space="preserve"> of standing in </w:t>
+        <w:t xml:space="preserve"> (</w:t>
+      </w:r>
+      <w:r>
+        <w:rPr>
+          <w:rFonts w:ascii="SBL Hebrew" w:hAnsi="SBL Hebrew" w:cs="SBL Hebrew" w:eastAsia="SBL Hebrew"/>
+          <w:b w:val="0"/>
+          <w:i w:val="0"/>
+          <w:color w:val="1A1A1A"/>
+          <w:sz w:val="22"/>
+        </w:rPr>
+        <w:t>זְכוּת</w:t>
+      </w:r>
+      <w:r>
+        <w:rPr>
+          <w:rFonts w:ascii="Georgia" w:hAnsi="Georgia" w:cs="SBL Hebrew" w:eastAsia="Georgia"/>
+          <w:b w:val="0"/>
+          <w:i w:val="0"/>
+          <w:color w:val="1A1A1A"/>
+          <w:sz w:val="22"/>
+        </w:rPr>
+        <w:t xml:space="preserve">) of standing in </w:t>
       </w:r>
       <w:r>
         <w:rPr>
@@ -4852,7 +5892,27 @@
           <w:color w:val="1A1A1A"/>
           <w:sz w:val="22"/>
         </w:rPr>
-        <w:t xml:space="preserve"> — is not incidental. </w:t>
+        <w:t xml:space="preserve"> (</w:t>
+      </w:r>
+      <w:r>
+        <w:rPr>
+          <w:rFonts w:ascii="SBL Hebrew" w:hAnsi="SBL Hebrew" w:cs="SBL Hebrew" w:eastAsia="SBL Hebrew"/>
+          <w:b w:val="0"/>
+          <w:i w:val="0"/>
+          <w:color w:val="1A1A1A"/>
+          <w:sz w:val="22"/>
+        </w:rPr>
+        <w:t>הַלְלוּיָהּ</w:t>
+      </w:r>
+      <w:r>
+        <w:rPr>
+          <w:rFonts w:ascii="Georgia" w:hAnsi="Georgia" w:cs="SBL Hebrew" w:eastAsia="Georgia"/>
+          <w:b w:val="0"/>
+          <w:i w:val="0"/>
+          <w:color w:val="1A1A1A"/>
+          <w:sz w:val="22"/>
+        </w:rPr>
+        <w:t xml:space="preserve">) — is not incidental. </w:t>
       </w:r>
       <w:r>
         <w:rPr>
@@ -4872,7 +5932,27 @@
           <w:color w:val="1A1A1A"/>
           <w:sz w:val="22"/>
         </w:rPr>
-        <w:t xml:space="preserve">, in his </w:t>
+        <w:t xml:space="preserve"> (</w:t>
+      </w:r>
+      <w:r>
+        <w:rPr>
+          <w:rFonts w:ascii="SBL Hebrew" w:hAnsi="SBL Hebrew" w:cs="SBL Hebrew" w:eastAsia="SBL Hebrew"/>
+          <w:b w:val="0"/>
+          <w:i w:val="0"/>
+          <w:color w:val="1A1A1A"/>
+          <w:sz w:val="22"/>
+        </w:rPr>
+        <w:t>רַב עַמְרָם גָּאוֹן</w:t>
+      </w:r>
+      <w:r>
+        <w:rPr>
+          <w:rFonts w:ascii="Georgia" w:hAnsi="Georgia" w:cs="SBL Hebrew" w:eastAsia="Georgia"/>
+          <w:b w:val="0"/>
+          <w:i w:val="0"/>
+          <w:color w:val="1A1A1A"/>
+          <w:sz w:val="22"/>
+        </w:rPr>
+        <w:t xml:space="preserve">), in his </w:t>
       </w:r>
       <w:r>
         <w:rPr>
@@ -5032,7 +6112,27 @@
           <w:color w:val="1A1A1A"/>
           <w:sz w:val="22"/>
         </w:rPr>
-        <w:t xml:space="preserve"> — a chain — that joins </w:t>
+        <w:t xml:space="preserve"> (</w:t>
+      </w:r>
+      <w:r>
+        <w:rPr>
+          <w:rFonts w:ascii="SBL Hebrew" w:hAnsi="SBL Hebrew" w:cs="SBL Hebrew" w:eastAsia="SBL Hebrew"/>
+          <w:b w:val="0"/>
+          <w:i w:val="0"/>
+          <w:color w:val="1A1A1A"/>
+          <w:sz w:val="22"/>
+        </w:rPr>
+        <w:t>שַׁלְשֶׁלֶת</w:t>
+      </w:r>
+      <w:r>
+        <w:rPr>
+          <w:rFonts w:ascii="Georgia" w:hAnsi="Georgia" w:cs="SBL Hebrew" w:eastAsia="Georgia"/>
+          <w:b w:val="0"/>
+          <w:i w:val="0"/>
+          <w:color w:val="1A1A1A"/>
+          <w:sz w:val="22"/>
+        </w:rPr>
+        <w:t xml:space="preserve">) — a chain — that joins </w:t>
       </w:r>
       <w:r>
         <w:rPr>
@@ -5182,7 +6282,27 @@
           <w:color w:val="1A1A1A"/>
           <w:sz w:val="22"/>
         </w:rPr>
-        <w:t xml:space="preserve">, they recite </w:t>
+        <w:t xml:space="preserve"> (</w:t>
+      </w:r>
+      <w:r>
+        <w:rPr>
+          <w:rFonts w:ascii="SBL Hebrew" w:hAnsi="SBL Hebrew" w:cs="SBL Hebrew" w:eastAsia="SBL Hebrew"/>
+          <w:b w:val="0"/>
+          <w:i w:val="0"/>
+          <w:color w:val="1A1A1A"/>
+          <w:sz w:val="22"/>
+        </w:rPr>
+        <w:t>וְעַד עוֹלָם</w:t>
+      </w:r>
+      <w:r>
+        <w:rPr>
+          <w:rFonts w:ascii="Georgia" w:hAnsi="Georgia" w:cs="SBL Hebrew" w:eastAsia="Georgia"/>
+          <w:b w:val="0"/>
+          <w:i w:val="0"/>
+          <w:color w:val="1A1A1A"/>
+          <w:sz w:val="22"/>
+        </w:rPr>
+        <w:t xml:space="preserve">), they recite </w:t>
       </w:r>
       <w:r>
         <w:rPr>
@@ -5362,7 +6482,27 @@
           <w:color w:val="1A1A1A"/>
           <w:sz w:val="22"/>
         </w:rPr>
-        <w:t xml:space="preserve">, in his </w:t>
+        <w:t xml:space="preserve"> (</w:t>
+      </w:r>
+      <w:r>
+        <w:rPr>
+          <w:rFonts w:ascii="SBL Hebrew" w:hAnsi="SBL Hebrew" w:cs="SBL Hebrew" w:eastAsia="SBL Hebrew"/>
+          <w:b w:val="0"/>
+          <w:i w:val="0"/>
+          <w:color w:val="1A1A1A"/>
+          <w:sz w:val="22"/>
+        </w:rPr>
+        <w:t>רַב שְׁלֹמֹה קְלוּגֶר</w:t>
+      </w:r>
+      <w:r>
+        <w:rPr>
+          <w:rFonts w:ascii="Georgia" w:hAnsi="Georgia" w:cs="SBL Hebrew" w:eastAsia="Georgia"/>
+          <w:b w:val="0"/>
+          <w:i w:val="0"/>
+          <w:color w:val="1A1A1A"/>
+          <w:sz w:val="22"/>
+        </w:rPr>
+        <w:t xml:space="preserve">), in his </w:t>
       </w:r>
       <w:r>
         <w:rPr>
@@ -5382,7 +6522,27 @@
           <w:color w:val="1A1A1A"/>
           <w:sz w:val="22"/>
         </w:rPr>
-        <w:t xml:space="preserve"> on </w:t>
+        <w:t xml:space="preserve"> (</w:t>
+      </w:r>
+      <w:r>
+        <w:rPr>
+          <w:rFonts w:ascii="SBL Hebrew" w:hAnsi="SBL Hebrew" w:cs="SBL Hebrew" w:eastAsia="SBL Hebrew"/>
+          <w:b w:val="0"/>
+          <w:i w:val="0"/>
+          <w:color w:val="1A1A1A"/>
+          <w:sz w:val="22"/>
+        </w:rPr>
+        <w:t>פֵּרוּשׁ</w:t>
+      </w:r>
+      <w:r>
+        <w:rPr>
+          <w:rFonts w:ascii="Georgia" w:hAnsi="Georgia" w:cs="SBL Hebrew" w:eastAsia="Georgia"/>
+          <w:b w:val="0"/>
+          <w:i w:val="0"/>
+          <w:color w:val="1A1A1A"/>
+          <w:sz w:val="22"/>
+        </w:rPr>
+        <w:t xml:space="preserve">) on </w:t>
       </w:r>
       <w:r>
         <w:rPr>
@@ -5402,7 +6562,27 @@
           <w:color w:val="1A1A1A"/>
           <w:sz w:val="22"/>
         </w:rPr>
-        <w:t>,</w:t>
+        <w:t xml:space="preserve"> (</w:t>
+      </w:r>
+      <w:r>
+        <w:rPr>
+          <w:rFonts w:ascii="SBL Hebrew" w:hAnsi="SBL Hebrew" w:cs="SBL Hebrew" w:eastAsia="SBL Hebrew"/>
+          <w:b w:val="0"/>
+          <w:i w:val="0"/>
+          <w:color w:val="1A1A1A"/>
+          <w:sz w:val="22"/>
+        </w:rPr>
+        <w:t>אֹרַח חַיִּים</w:t>
+      </w:r>
+      <w:r>
+        <w:rPr>
+          <w:rFonts w:ascii="Georgia" w:hAnsi="Georgia" w:cs="SBL Hebrew" w:eastAsia="Georgia"/>
+          <w:b w:val="0"/>
+          <w:i w:val="0"/>
+          <w:color w:val="1A1A1A"/>
+          <w:sz w:val="22"/>
+        </w:rPr>
+        <w:t>),</w:t>
       </w:r>
       <w:r>
         <w:rPr>
@@ -5441,7 +6621,27 @@
           <w:color w:val="1A1A1A"/>
           <w:sz w:val="22"/>
         </w:rPr>
-        <w:t xml:space="preserve"> grounds. There is a </w:t>
+        <w:t xml:space="preserve"> (</w:t>
+      </w:r>
+      <w:r>
+        <w:rPr>
+          <w:rFonts w:ascii="SBL Hebrew" w:hAnsi="SBL Hebrew" w:cs="SBL Hebrew" w:eastAsia="SBL Hebrew"/>
+          <w:b w:val="0"/>
+          <w:i w:val="0"/>
+          <w:color w:val="1A1A1A"/>
+          <w:sz w:val="22"/>
+        </w:rPr>
+        <w:t>נִגְלֶה</w:t>
+      </w:r>
+      <w:r>
+        <w:rPr>
+          <w:rFonts w:ascii="Georgia" w:hAnsi="Georgia" w:cs="SBL Hebrew" w:eastAsia="Georgia"/>
+          <w:b w:val="0"/>
+          <w:i w:val="0"/>
+          <w:color w:val="1A1A1A"/>
+          <w:sz w:val="22"/>
+        </w:rPr>
+        <w:t xml:space="preserve">) grounds. There is a </w:t>
       </w:r>
       <w:r>
         <w:rPr>
@@ -5461,7 +6661,27 @@
           <w:color w:val="1A1A1A"/>
           <w:sz w:val="22"/>
         </w:rPr>
-        <w:t xml:space="preserve">, he writes, that any </w:t>
+        <w:t xml:space="preserve"> (</w:t>
+      </w:r>
+      <w:r>
+        <w:rPr>
+          <w:rFonts w:ascii="SBL Hebrew" w:hAnsi="SBL Hebrew" w:cs="SBL Hebrew" w:eastAsia="SBL Hebrew"/>
+          <w:b w:val="0"/>
+          <w:i w:val="0"/>
+          <w:color w:val="1A1A1A"/>
+          <w:sz w:val="22"/>
+        </w:rPr>
+        <w:t>כְּלָל</w:t>
+      </w:r>
+      <w:r>
+        <w:rPr>
+          <w:rFonts w:ascii="Georgia" w:hAnsi="Georgia" w:cs="SBL Hebrew" w:eastAsia="Georgia"/>
+          <w:b w:val="0"/>
+          <w:i w:val="0"/>
+          <w:color w:val="1A1A1A"/>
+          <w:sz w:val="22"/>
+        </w:rPr>
+        <w:t xml:space="preserve">), he writes, that any </w:t>
       </w:r>
       <w:r>
         <w:rPr>
@@ -5481,7 +6701,27 @@
           <w:color w:val="1A1A1A"/>
           <w:sz w:val="22"/>
         </w:rPr>
-        <w:t xml:space="preserve"> Moshe Rabbeinu did not say, we do not say — that is, we do not manufacture new </w:t>
+        <w:t xml:space="preserve"> Moshe Rabbeinu (</w:t>
+      </w:r>
+      <w:r>
+        <w:rPr>
+          <w:rFonts w:ascii="SBL Hebrew" w:hAnsi="SBL Hebrew" w:cs="SBL Hebrew" w:eastAsia="SBL Hebrew"/>
+          <w:b w:val="0"/>
+          <w:i w:val="0"/>
+          <w:color w:val="1A1A1A"/>
+          <w:sz w:val="22"/>
+        </w:rPr>
+        <w:t>מֹשֶׁה רַבֵּנוּ</w:t>
+      </w:r>
+      <w:r>
+        <w:rPr>
+          <w:rFonts w:ascii="Georgia" w:hAnsi="Georgia" w:cs="SBL Hebrew" w:eastAsia="Georgia"/>
+          <w:b w:val="0"/>
+          <w:i w:val="0"/>
+          <w:color w:val="1A1A1A"/>
+          <w:sz w:val="22"/>
+        </w:rPr>
+        <w:t xml:space="preserve">) did not say, we do not say — that is, we do not manufacture new </w:t>
       </w:r>
       <w:r>
         <w:rPr>
@@ -5621,7 +6861,27 @@
           <w:color w:val="1A1A1A"/>
           <w:sz w:val="22"/>
         </w:rPr>
-        <w:t>.</w:t>
+        <w:t xml:space="preserve"> (</w:t>
+      </w:r>
+      <w:r>
+        <w:rPr>
+          <w:rFonts w:ascii="SBL Hebrew" w:hAnsi="SBL Hebrew" w:cs="SBL Hebrew" w:eastAsia="SBL Hebrew"/>
+          <w:b w:val="0"/>
+          <w:i w:val="0"/>
+          <w:color w:val="1A1A1A"/>
+          <w:sz w:val="22"/>
+        </w:rPr>
+        <w:t>תָּנָ"ךְ</w:t>
+      </w:r>
+      <w:r>
+        <w:rPr>
+          <w:rFonts w:ascii="Georgia" w:hAnsi="Georgia" w:cs="SBL Hebrew" w:eastAsia="Georgia"/>
+          <w:b w:val="0"/>
+          <w:i w:val="0"/>
+          <w:color w:val="1A1A1A"/>
+          <w:sz w:val="22"/>
+        </w:rPr>
+        <w:t>).</w:t>
       </w:r>
     </w:p>
     <w:p>
@@ -5676,7 +6936,27 @@
           <w:color w:val="1A1A1A"/>
           <w:sz w:val="22"/>
         </w:rPr>
-        <w:t xml:space="preserve"> break, every </w:t>
+        <w:t xml:space="preserve"> (</w:t>
+      </w:r>
+      <w:r>
+        <w:rPr>
+          <w:rFonts w:ascii="SBL Hebrew" w:hAnsi="SBL Hebrew" w:cs="SBL Hebrew" w:eastAsia="SBL Hebrew"/>
+          <w:b w:val="0"/>
+          <w:i w:val="0"/>
+          <w:color w:val="1A1A1A"/>
+          <w:sz w:val="22"/>
+        </w:rPr>
+        <w:t>קְרִיאַת הַתּוֹרָה</w:t>
+      </w:r>
+      <w:r>
+        <w:rPr>
+          <w:rFonts w:ascii="Georgia" w:hAnsi="Georgia" w:cs="SBL Hebrew" w:eastAsia="Georgia"/>
+          <w:b w:val="0"/>
+          <w:i w:val="0"/>
+          <w:color w:val="1A1A1A"/>
+          <w:sz w:val="22"/>
+        </w:rPr>
+        <w:t xml:space="preserve">) break, every </w:t>
       </w:r>
       <w:r>
         <w:rPr>
@@ -5696,7 +6976,27 @@
           <w:color w:val="1A1A1A"/>
           <w:sz w:val="22"/>
         </w:rPr>
-        <w:t xml:space="preserve"> composed from scriptural fragments, every </w:t>
+        <w:t xml:space="preserve"> (</w:t>
+      </w:r>
+      <w:r>
+        <w:rPr>
+          <w:rFonts w:ascii="SBL Hebrew" w:hAnsi="SBL Hebrew" w:cs="SBL Hebrew" w:eastAsia="SBL Hebrew"/>
+          <w:b w:val="0"/>
+          <w:i w:val="0"/>
+          <w:color w:val="1A1A1A"/>
+          <w:sz w:val="22"/>
+        </w:rPr>
+        <w:t>פִּיּוּט</w:t>
+      </w:r>
+      <w:r>
+        <w:rPr>
+          <w:rFonts w:ascii="Georgia" w:hAnsi="Georgia" w:cs="SBL Hebrew" w:eastAsia="Georgia"/>
+          <w:b w:val="0"/>
+          <w:i w:val="0"/>
+          <w:color w:val="1A1A1A"/>
+          <w:sz w:val="22"/>
+        </w:rPr>
+        <w:t xml:space="preserve">) composed from scriptural fragments, every </w:t>
       </w:r>
       <w:r>
         <w:rPr>
@@ -5716,7 +7016,27 @@
           <w:color w:val="1A1A1A"/>
           <w:sz w:val="22"/>
         </w:rPr>
-        <w:t xml:space="preserve"> stitched from partial verses, is a case of joining Scripture without generating a formal </w:t>
+        <w:t xml:space="preserve"> (</w:t>
+      </w:r>
+      <w:r>
+        <w:rPr>
+          <w:rFonts w:ascii="SBL Hebrew" w:hAnsi="SBL Hebrew" w:cs="SBL Hebrew" w:eastAsia="SBL Hebrew"/>
+          <w:b w:val="0"/>
+          <w:i w:val="0"/>
+          <w:color w:val="1A1A1A"/>
+          <w:sz w:val="22"/>
+        </w:rPr>
+        <w:t>יְהִי רָצוֹן</w:t>
+      </w:r>
+      <w:r>
+        <w:rPr>
+          <w:rFonts w:ascii="Georgia" w:hAnsi="Georgia" w:cs="SBL Hebrew" w:eastAsia="Georgia"/>
+          <w:b w:val="0"/>
+          <w:i w:val="0"/>
+          <w:color w:val="1A1A1A"/>
+          <w:sz w:val="22"/>
+        </w:rPr>
+        <w:t xml:space="preserve">) stitched from partial verses, is a case of joining Scripture without generating a formal </w:t>
       </w:r>
       <w:r>
         <w:rPr>
@@ -5871,7 +7191,27 @@
           <w:color w:val="1A1A1A"/>
           <w:sz w:val="22"/>
         </w:rPr>
-        <w:t xml:space="preserve">, following the </w:t>
+        <w:t xml:space="preserve"> (</w:t>
+      </w:r>
+      <w:r>
+        <w:rPr>
+          <w:rFonts w:ascii="SBL Hebrew" w:hAnsi="SBL Hebrew" w:cs="SBL Hebrew" w:eastAsia="SBL Hebrew"/>
+          <w:b w:val="0"/>
+          <w:i w:val="0"/>
+          <w:color w:val="1A1A1A"/>
+          <w:sz w:val="22"/>
+        </w:rPr>
+        <w:t>מְקֻבָּלִים</w:t>
+      </w:r>
+      <w:r>
+        <w:rPr>
+          <w:rFonts w:ascii="Georgia" w:hAnsi="Georgia" w:cs="SBL Hebrew" w:eastAsia="Georgia"/>
+          <w:b w:val="0"/>
+          <w:i w:val="0"/>
+          <w:color w:val="1A1A1A"/>
+          <w:sz w:val="22"/>
+        </w:rPr>
+        <w:t xml:space="preserve">), following the </w:t>
       </w:r>
       <w:r>
         <w:rPr>
@@ -5891,7 +7231,27 @@
           <w:color w:val="1A1A1A"/>
           <w:sz w:val="22"/>
         </w:rPr>
-        <w:t xml:space="preserve">, preserve the chained recitation on </w:t>
+        <w:t xml:space="preserve"> (</w:t>
+      </w:r>
+      <w:r>
+        <w:rPr>
+          <w:rFonts w:ascii="SBL Hebrew" w:hAnsi="SBL Hebrew" w:cs="SBL Hebrew" w:eastAsia="SBL Hebrew"/>
+          <w:b w:val="0"/>
+          <w:i w:val="0"/>
+          <w:color w:val="1A1A1A"/>
+          <w:sz w:val="22"/>
+        </w:rPr>
+        <w:t>אֲרִיזַ"ל</w:t>
+      </w:r>
+      <w:r>
+        <w:rPr>
+          <w:rFonts w:ascii="Georgia" w:hAnsi="Georgia" w:cs="SBL Hebrew" w:eastAsia="Georgia"/>
+          <w:b w:val="0"/>
+          <w:i w:val="0"/>
+          <w:color w:val="1A1A1A"/>
+          <w:sz w:val="22"/>
+        </w:rPr>
+        <w:t xml:space="preserve">), preserve the chained recitation on </w:t>
       </w:r>
       <w:r>
         <w:rPr>
@@ -5911,7 +7271,27 @@
           <w:color w:val="1A1A1A"/>
           <w:sz w:val="22"/>
         </w:rPr>
-        <w:t xml:space="preserve"> grounds: the </w:t>
+        <w:t xml:space="preserve"> (</w:t>
+      </w:r>
+      <w:r>
+        <w:rPr>
+          <w:rFonts w:ascii="SBL Hebrew" w:hAnsi="SBL Hebrew" w:cs="SBL Hebrew" w:eastAsia="SBL Hebrew"/>
+          <w:b w:val="0"/>
+          <w:i w:val="0"/>
+          <w:color w:val="1A1A1A"/>
+          <w:sz w:val="22"/>
+        </w:rPr>
+        <w:t>סוֹד</w:t>
+      </w:r>
+      <w:r>
+        <w:rPr>
+          <w:rFonts w:ascii="Georgia" w:hAnsi="Georgia" w:cs="SBL Hebrew" w:eastAsia="Georgia"/>
+          <w:b w:val="0"/>
+          <w:i w:val="0"/>
+          <w:color w:val="1A1A1A"/>
+          <w:sz w:val="22"/>
+        </w:rPr>
+        <w:t xml:space="preserve">) grounds: the </w:t>
       </w:r>
       <w:r>
         <w:rPr>
@@ -5951,7 +7331,27 @@
           <w:color w:val="1A1A1A"/>
           <w:sz w:val="22"/>
         </w:rPr>
-        <w:t xml:space="preserve"> whose necessity does not depend on the </w:t>
+        <w:t xml:space="preserve"> (</w:t>
+      </w:r>
+      <w:r>
+        <w:rPr>
+          <w:rFonts w:ascii="SBL Hebrew" w:hAnsi="SBL Hebrew" w:cs="SBL Hebrew" w:eastAsia="SBL Hebrew"/>
+          <w:b w:val="0"/>
+          <w:i w:val="0"/>
+          <w:color w:val="1A1A1A"/>
+          <w:sz w:val="22"/>
+        </w:rPr>
+        <w:t>תִּקּוּן</w:t>
+      </w:r>
+      <w:r>
+        <w:rPr>
+          <w:rFonts w:ascii="Georgia" w:hAnsi="Georgia" w:cs="SBL Hebrew" w:eastAsia="Georgia"/>
+          <w:b w:val="0"/>
+          <w:i w:val="0"/>
+          <w:color w:val="1A1A1A"/>
+          <w:sz w:val="22"/>
+        </w:rPr>
+        <w:t xml:space="preserve">) whose necessity does not depend on the </w:t>
       </w:r>
       <w:r>
         <w:rPr>
@@ -5991,7 +7391,27 @@
           <w:color w:val="1A1A1A"/>
           <w:sz w:val="22"/>
         </w:rPr>
-        <w:t xml:space="preserve">. What is worth carrying away is that a small liturgical detail — whether one pause before beginning </w:t>
+        <w:t xml:space="preserve"> (</w:t>
+      </w:r>
+      <w:r>
+        <w:rPr>
+          <w:rFonts w:ascii="SBL Hebrew" w:hAnsi="SBL Hebrew" w:cs="SBL Hebrew" w:eastAsia="SBL Hebrew"/>
+          <w:b w:val="0"/>
+          <w:i w:val="0"/>
+          <w:color w:val="1A1A1A"/>
+          <w:sz w:val="22"/>
+        </w:rPr>
+        <w:t>מָסוֹרָה</w:t>
+      </w:r>
+      <w:r>
+        <w:rPr>
+          <w:rFonts w:ascii="Georgia" w:hAnsi="Georgia" w:cs="SBL Hebrew" w:eastAsia="Georgia"/>
+          <w:b w:val="0"/>
+          <w:i w:val="0"/>
+          <w:color w:val="1A1A1A"/>
+          <w:sz w:val="22"/>
+        </w:rPr>
+        <w:t xml:space="preserve">). What is worth carrying away is that a small liturgical detail — whether one pause before beginning </w:t>
       </w:r>
       <w:r>
         <w:rPr>
@@ -6051,7 +7471,27 @@
           <w:color w:val="1A1A1A"/>
           <w:sz w:val="22"/>
         </w:rPr>
-        <w:t xml:space="preserve"> tradition, both of which the </w:t>
+        <w:t xml:space="preserve"> (</w:t>
+      </w:r>
+      <w:r>
+        <w:rPr>
+          <w:rFonts w:ascii="SBL Hebrew" w:hAnsi="SBL Hebrew" w:cs="SBL Hebrew" w:eastAsia="SBL Hebrew"/>
+          <w:b w:val="0"/>
+          <w:i w:val="0"/>
+          <w:color w:val="1A1A1A"/>
+          <w:sz w:val="22"/>
+        </w:rPr>
+        <w:t>נִסְתָּר</w:t>
+      </w:r>
+      <w:r>
+        <w:rPr>
+          <w:rFonts w:ascii="Georgia" w:hAnsi="Georgia" w:cs="SBL Hebrew" w:eastAsia="Georgia"/>
+          <w:b w:val="0"/>
+          <w:i w:val="0"/>
+          <w:color w:val="1A1A1A"/>
+          <w:sz w:val="22"/>
+        </w:rPr>
+        <w:t xml:space="preserve">) tradition, both of which the </w:t>
       </w:r>
       <w:r>
         <w:rPr>
@@ -6071,7 +7511,27 @@
           <w:color w:val="1A1A1A"/>
           <w:sz w:val="22"/>
         </w:rPr>
-        <w:t xml:space="preserve"> weighed.</w:t>
+        <w:t xml:space="preserve"> (</w:t>
+      </w:r>
+      <w:r>
+        <w:rPr>
+          <w:rFonts w:ascii="SBL Hebrew" w:hAnsi="SBL Hebrew" w:cs="SBL Hebrew" w:eastAsia="SBL Hebrew"/>
+          <w:b w:val="0"/>
+          <w:i w:val="0"/>
+          <w:color w:val="1A1A1A"/>
+          <w:sz w:val="22"/>
+        </w:rPr>
+        <w:t>פּוֹסְקִים</w:t>
+      </w:r>
+      <w:r>
+        <w:rPr>
+          <w:rFonts w:ascii="Georgia" w:hAnsi="Georgia" w:cs="SBL Hebrew" w:eastAsia="Georgia"/>
+          <w:b w:val="0"/>
+          <w:i w:val="0"/>
+          <w:color w:val="1A1A1A"/>
+          <w:sz w:val="22"/>
+        </w:rPr>
+        <w:t>) weighed.</w:t>
       </w:r>
     </w:p>
     <w:p>
@@ -6140,7 +7600,27 @@
           <w:color w:val="1A1A1A"/>
           <w:sz w:val="22"/>
         </w:rPr>
-        <w:t xml:space="preserve"> in </w:t>
+        <w:t xml:space="preserve"> (</w:t>
+      </w:r>
+      <w:r>
+        <w:rPr>
+          <w:rFonts w:ascii="SBL Hebrew" w:hAnsi="SBL Hebrew" w:cs="SBL Hebrew" w:eastAsia="SBL Hebrew"/>
+          <w:b w:val="0"/>
+          <w:i w:val="0"/>
+          <w:color w:val="1A1A1A"/>
+          <w:sz w:val="22"/>
+        </w:rPr>
+        <w:t>טוּר</w:t>
+      </w:r>
+      <w:r>
+        <w:rPr>
+          <w:rFonts w:ascii="Georgia" w:hAnsi="Georgia" w:cs="SBL Hebrew" w:eastAsia="Georgia"/>
+          <w:b w:val="0"/>
+          <w:i w:val="0"/>
+          <w:color w:val="1A1A1A"/>
+          <w:sz w:val="22"/>
+        </w:rPr>
+        <w:t xml:space="preserve">) in </w:t>
       </w:r>
       <w:r>
         <w:rPr>
@@ -6189,7 +7669,27 @@
           <w:color w:val="1A1A1A"/>
           <w:sz w:val="22"/>
         </w:rPr>
-        <w:t xml:space="preserve"> from the Sephardic communities of his era: at the end of every discrete section of </w:t>
+        <w:t xml:space="preserve"> (</w:t>
+      </w:r>
+      <w:r>
+        <w:rPr>
+          <w:rFonts w:ascii="SBL Hebrew" w:hAnsi="SBL Hebrew" w:cs="SBL Hebrew" w:eastAsia="SBL Hebrew"/>
+          <w:b w:val="0"/>
+          <w:i w:val="0"/>
+          <w:color w:val="1A1A1A"/>
+          <w:sz w:val="22"/>
+        </w:rPr>
+        <w:t>מִנְהָג</w:t>
+      </w:r>
+      <w:r>
+        <w:rPr>
+          <w:rFonts w:ascii="Georgia" w:hAnsi="Georgia" w:cs="SBL Hebrew" w:eastAsia="Georgia"/>
+          <w:b w:val="0"/>
+          <w:i w:val="0"/>
+          <w:color w:val="1A1A1A"/>
+          <w:sz w:val="22"/>
+        </w:rPr>
+        <w:t xml:space="preserve">) from the Sephardic communities of his era: at the end of every discrete section of </w:t>
       </w:r>
       <w:r>
         <w:rPr>
@@ -6284,7 +7784,27 @@
           <w:color w:val="1A1A1A"/>
           <w:sz w:val="22"/>
         </w:rPr>
-        <w:t xml:space="preserve"> at the very end of </w:t>
+        <w:t xml:space="preserve"> (</w:t>
+      </w:r>
+      <w:r>
+        <w:rPr>
+          <w:rFonts w:ascii="SBL Hebrew" w:hAnsi="SBL Hebrew" w:cs="SBL Hebrew" w:eastAsia="SBL Hebrew"/>
+          <w:b w:val="0"/>
+          <w:i w:val="0"/>
+          <w:color w:val="1A1A1A"/>
+          <w:sz w:val="22"/>
+        </w:rPr>
+        <w:t>כֹּל הַנְּשָׁמָה תְּהַלֵּל יָ-הּ</w:t>
+      </w:r>
+      <w:r>
+        <w:rPr>
+          <w:rFonts w:ascii="Georgia" w:hAnsi="Georgia" w:cs="SBL Hebrew" w:eastAsia="Georgia"/>
+          <w:b w:val="0"/>
+          <w:i w:val="0"/>
+          <w:color w:val="1A1A1A"/>
+          <w:sz w:val="22"/>
+        </w:rPr>
+        <w:t xml:space="preserve">) at the very end of </w:t>
       </w:r>
       <w:r>
         <w:rPr>
@@ -6404,7 +7924,27 @@
           <w:color w:val="1A1A1A"/>
           <w:sz w:val="22"/>
         </w:rPr>
-        <w:t xml:space="preserve">, though they stand between </w:t>
+        <w:t xml:space="preserve"> (</w:t>
+      </w:r>
+      <w:r>
+        <w:rPr>
+          <w:rFonts w:ascii="SBL Hebrew" w:hAnsi="SBL Hebrew" w:cs="SBL Hebrew" w:eastAsia="SBL Hebrew"/>
+          <w:b w:val="0"/>
+          <w:i w:val="0"/>
+          <w:color w:val="1A1A1A"/>
+          <w:sz w:val="22"/>
+        </w:rPr>
+        <w:t>שִׁירַת הַיָּם</w:t>
+      </w:r>
+      <w:r>
+        <w:rPr>
+          <w:rFonts w:ascii="Georgia" w:hAnsi="Georgia" w:cs="SBL Hebrew" w:eastAsia="Georgia"/>
+          <w:b w:val="0"/>
+          <w:i w:val="0"/>
+          <w:color w:val="1A1A1A"/>
+          <w:sz w:val="22"/>
+        </w:rPr>
+        <w:t xml:space="preserve">), though they stand between </w:t>
       </w:r>
       <w:r>
         <w:rPr>
@@ -6464,7 +8004,27 @@
           <w:color w:val="1A1A1A"/>
           <w:sz w:val="22"/>
         </w:rPr>
-        <w:t xml:space="preserve"> at the end of </w:t>
+        <w:t xml:space="preserve"> (</w:t>
+      </w:r>
+      <w:r>
+        <w:rPr>
+          <w:rFonts w:ascii="SBL Hebrew" w:hAnsi="SBL Hebrew" w:cs="SBL Hebrew" w:eastAsia="SBL Hebrew"/>
+          <w:b w:val="0"/>
+          <w:i w:val="0"/>
+          <w:color w:val="1A1A1A"/>
+          <w:sz w:val="22"/>
+        </w:rPr>
+        <w:t>ה' יִמְלֹךְ לְעוֹלָם וָעֶד</w:t>
+      </w:r>
+      <w:r>
+        <w:rPr>
+          <w:rFonts w:ascii="Georgia" w:hAnsi="Georgia" w:cs="SBL Hebrew" w:eastAsia="Georgia"/>
+          <w:b w:val="0"/>
+          <w:i w:val="0"/>
+          <w:color w:val="1A1A1A"/>
+          <w:sz w:val="22"/>
+        </w:rPr>
+        <w:t xml:space="preserve">) at the end of </w:t>
       </w:r>
       <w:r>
         <w:rPr>
@@ -6504,7 +8064,27 @@
           <w:color w:val="1A1A1A"/>
           <w:sz w:val="22"/>
         </w:rPr>
-        <w:t>.</w:t>
+        <w:t xml:space="preserve"> (</w:t>
+      </w:r>
+      <w:r>
+        <w:rPr>
+          <w:rFonts w:ascii="SBL Hebrew" w:hAnsi="SBL Hebrew" w:cs="SBL Hebrew" w:eastAsia="SBL Hebrew"/>
+          <w:b w:val="0"/>
+          <w:i w:val="0"/>
+          <w:color w:val="1A1A1A"/>
+          <w:sz w:val="22"/>
+        </w:rPr>
+        <w:t>שִׁירָה</w:t>
+      </w:r>
+      <w:r>
+        <w:rPr>
+          <w:rFonts w:ascii="Georgia" w:hAnsi="Georgia" w:cs="SBL Hebrew" w:eastAsia="Georgia"/>
+          <w:b w:val="0"/>
+          <w:i w:val="0"/>
+          <w:color w:val="1A1A1A"/>
+          <w:sz w:val="22"/>
+        </w:rPr>
+        <w:t>).</w:t>
       </w:r>
     </w:p>
     <w:p>
@@ -6598,7 +8178,27 @@
           <w:color w:val="1A1A1A"/>
           <w:sz w:val="22"/>
         </w:rPr>
-        <w:t xml:space="preserve"> between the </w:t>
+        <w:t xml:space="preserve"> (</w:t>
+      </w:r>
+      <w:r>
+        <w:rPr>
+          <w:rFonts w:ascii="SBL Hebrew" w:hAnsi="SBL Hebrew" w:cs="SBL Hebrew" w:eastAsia="SBL Hebrew"/>
+          <w:b w:val="0"/>
+          <w:i w:val="0"/>
+          <w:color w:val="1A1A1A"/>
+          <w:sz w:val="22"/>
+        </w:rPr>
+        <w:t>סְתִירָה</w:t>
+      </w:r>
+      <w:r>
+        <w:rPr>
+          <w:rFonts w:ascii="Georgia" w:hAnsi="Georgia" w:cs="SBL Hebrew" w:eastAsia="Georgia"/>
+          <w:b w:val="0"/>
+          <w:i w:val="0"/>
+          <w:color w:val="1A1A1A"/>
+          <w:sz w:val="22"/>
+        </w:rPr>
+        <w:t xml:space="preserve">) between the </w:t>
       </w:r>
       <w:r>
         <w:rPr>
@@ -6638,7 +8238,27 @@
           <w:color w:val="1A1A1A"/>
           <w:sz w:val="22"/>
         </w:rPr>
-        <w:t>.</w:t>
+        <w:t xml:space="preserve"> (</w:t>
+      </w:r>
+      <w:r>
+        <w:rPr>
+          <w:rFonts w:ascii="SBL Hebrew" w:hAnsi="SBL Hebrew" w:cs="SBL Hebrew" w:eastAsia="SBL Hebrew"/>
+          <w:b w:val="0"/>
+          <w:i w:val="0"/>
+          <w:color w:val="1A1A1A"/>
+          <w:sz w:val="22"/>
+        </w:rPr>
+        <w:t>סֵפֶר תּוֹרָה</w:t>
+      </w:r>
+      <w:r>
+        <w:rPr>
+          <w:rFonts w:ascii="Georgia" w:hAnsi="Georgia" w:cs="SBL Hebrew" w:eastAsia="Georgia"/>
+          <w:b w:val="0"/>
+          <w:i w:val="0"/>
+          <w:color w:val="1A1A1A"/>
+          <w:sz w:val="22"/>
+        </w:rPr>
+        <w:t>).</w:t>
       </w:r>
     </w:p>
     <w:p>
@@ -6772,6 +8392,36 @@
       <w:r>
         <w:rPr>
           <w:rFonts w:ascii="Georgia" w:hAnsi="Georgia" w:cs="SBL Hebrew" w:eastAsia="Georgia"/>
+          <w:b w:val="0"/>
+          <w:i w:val="0"/>
+          <w:color w:val="1A1A1A"/>
+          <w:sz w:val="22"/>
+        </w:rPr>
+        <w:t xml:space="preserve"> (</w:t>
+      </w:r>
+      <w:r>
+        <w:rPr>
+          <w:rFonts w:ascii="SBL Hebrew" w:hAnsi="SBL Hebrew" w:cs="SBL Hebrew" w:eastAsia="SBL Hebrew"/>
+          <w:b w:val="0"/>
+          <w:i w:val="0"/>
+          <w:color w:val="1A1A1A"/>
+          <w:sz w:val="22"/>
+        </w:rPr>
+        <w:t>רַמְבַּ"ן</w:t>
+      </w:r>
+      <w:r>
+        <w:rPr>
+          <w:rFonts w:ascii="Georgia" w:hAnsi="Georgia" w:cs="SBL Hebrew" w:eastAsia="Georgia"/>
+          <w:b w:val="0"/>
+          <w:i w:val="0"/>
+          <w:color w:val="1A1A1A"/>
+          <w:sz w:val="22"/>
+        </w:rPr>
+        <w:t>)</w:t>
+      </w:r>
+      <w:r>
+        <w:rPr>
+          <w:rFonts w:ascii="Georgia" w:hAnsi="Georgia" w:cs="SBL Hebrew" w:eastAsia="Georgia"/>
           <w:color w:val="B8860B"/>
           <w:sz w:val="16"/>
           <w:vertAlign w:val="superscript"/>
@@ -6901,7 +8551,27 @@
           <w:color w:val="1A1A1A"/>
           <w:sz w:val="22"/>
         </w:rPr>
-        <w:t xml:space="preserve">, and </w:t>
+        <w:t xml:space="preserve"> (</w:t>
+      </w:r>
+      <w:r>
+        <w:rPr>
+          <w:rFonts w:ascii="SBL Hebrew" w:hAnsi="SBL Hebrew" w:cs="SBL Hebrew" w:eastAsia="SBL Hebrew"/>
+          <w:b w:val="0"/>
+          <w:i w:val="0"/>
+          <w:color w:val="1A1A1A"/>
+          <w:sz w:val="22"/>
+        </w:rPr>
+        <w:t>אָרִיחַ עַל גַּבֵּי לְבֵנָה</w:t>
+      </w:r>
+      <w:r>
+        <w:rPr>
+          <w:rFonts w:ascii="Georgia" w:hAnsi="Georgia" w:cs="SBL Hebrew" w:eastAsia="Georgia"/>
+          <w:b w:val="0"/>
+          <w:i w:val="0"/>
+          <w:color w:val="1A1A1A"/>
+          <w:sz w:val="22"/>
+        </w:rPr>
+        <w:t xml:space="preserve">), and </w:t>
       </w:r>
       <w:r>
         <w:rPr>
@@ -6961,7 +8631,27 @@
           <w:color w:val="1A1A1A"/>
           <w:sz w:val="22"/>
         </w:rPr>
-        <w:t xml:space="preserve"> in </w:t>
+        <w:t xml:space="preserve"> (</w:t>
+      </w:r>
+      <w:r>
+        <w:rPr>
+          <w:rFonts w:ascii="SBL Hebrew" w:hAnsi="SBL Hebrew" w:cs="SBL Hebrew" w:eastAsia="SBL Hebrew"/>
+          <w:b w:val="0"/>
+          <w:i w:val="0"/>
+          <w:color w:val="1A1A1A"/>
+          <w:sz w:val="22"/>
+        </w:rPr>
+        <w:t>רַמְבַּ"ם</w:t>
+      </w:r>
+      <w:r>
+        <w:rPr>
+          <w:rFonts w:ascii="Georgia" w:hAnsi="Georgia" w:cs="SBL Hebrew" w:eastAsia="Georgia"/>
+          <w:b w:val="0"/>
+          <w:i w:val="0"/>
+          <w:color w:val="1A1A1A"/>
+          <w:sz w:val="22"/>
+        </w:rPr>
+        <w:t xml:space="preserve">) in </w:t>
       </w:r>
       <w:r>
         <w:rPr>
@@ -7001,7 +8691,27 @@
           <w:color w:val="1A1A1A"/>
           <w:sz w:val="22"/>
         </w:rPr>
-        <w:t>,</w:t>
+        <w:t xml:space="preserve"> (</w:t>
+      </w:r>
+      <w:r>
+        <w:rPr>
+          <w:rFonts w:ascii="SBL Hebrew" w:hAnsi="SBL Hebrew" w:cs="SBL Hebrew" w:eastAsia="SBL Hebrew"/>
+          <w:b w:val="0"/>
+          <w:i w:val="0"/>
+          <w:color w:val="1A1A1A"/>
+          <w:sz w:val="22"/>
+        </w:rPr>
+        <w:t>מַסֶּכֶת סוֹפְרִים</w:t>
+      </w:r>
+      <w:r>
+        <w:rPr>
+          <w:rFonts w:ascii="Georgia" w:hAnsi="Georgia" w:cs="SBL Hebrew" w:eastAsia="Georgia"/>
+          <w:b w:val="0"/>
+          <w:i w:val="0"/>
+          <w:color w:val="1A1A1A"/>
+          <w:sz w:val="22"/>
+        </w:rPr>
+        <w:t>),</w:t>
       </w:r>
       <w:r>
         <w:rPr>
@@ -7080,7 +8790,27 @@
           <w:color w:val="1A1A1A"/>
           <w:sz w:val="22"/>
         </w:rPr>
-        <w:t xml:space="preserve">: the </w:t>
+        <w:t xml:space="preserve"> (</w:t>
+      </w:r>
+      <w:r>
+        <w:rPr>
+          <w:rFonts w:ascii="SBL Hebrew" w:hAnsi="SBL Hebrew" w:cs="SBL Hebrew" w:eastAsia="SBL Hebrew"/>
+          <w:b w:val="0"/>
+          <w:i w:val="0"/>
+          <w:color w:val="1A1A1A"/>
+          <w:sz w:val="22"/>
+        </w:rPr>
+        <w:t>מְסוֹרוֹת</w:t>
+      </w:r>
+      <w:r>
+        <w:rPr>
+          <w:rFonts w:ascii="Georgia" w:hAnsi="Georgia" w:cs="SBL Hebrew" w:eastAsia="Georgia"/>
+          <w:b w:val="0"/>
+          <w:i w:val="0"/>
+          <w:color w:val="1A1A1A"/>
+          <w:sz w:val="22"/>
+        </w:rPr>
+        <w:t xml:space="preserve">): the </w:t>
       </w:r>
       <w:r>
         <w:rPr>
@@ -7230,7 +8960,27 @@
           <w:color w:val="1A1A1A"/>
           <w:sz w:val="22"/>
         </w:rPr>
-        <w:t xml:space="preserve">. The story is preserved in the biography </w:t>
+        <w:t xml:space="preserve"> (</w:t>
+      </w:r>
+      <w:r>
+        <w:rPr>
+          <w:rFonts w:ascii="SBL Hebrew" w:hAnsi="SBL Hebrew" w:cs="SBL Hebrew" w:eastAsia="SBL Hebrew"/>
+          <w:b w:val="0"/>
+          <w:i w:val="0"/>
+          <w:color w:val="1A1A1A"/>
+          <w:sz w:val="22"/>
+        </w:rPr>
+        <w:t>בְּרִיסְק</w:t>
+      </w:r>
+      <w:r>
+        <w:rPr>
+          <w:rFonts w:ascii="Georgia" w:hAnsi="Georgia" w:cs="SBL Hebrew" w:eastAsia="Georgia"/>
+          <w:b w:val="0"/>
+          <w:i w:val="0"/>
+          <w:color w:val="1A1A1A"/>
+          <w:sz w:val="22"/>
+        </w:rPr>
+        <w:t xml:space="preserve">). The story is preserved in the biography </w:t>
       </w:r>
       <w:r>
         <w:rPr>
@@ -7241,6 +8991,36 @@
           <w:sz w:val="22"/>
         </w:rPr>
         <w:t>HaSaraf MiBrisk</w:t>
+      </w:r>
+      <w:r>
+        <w:rPr>
+          <w:rFonts w:ascii="Georgia" w:hAnsi="Georgia" w:cs="SBL Hebrew" w:eastAsia="Georgia"/>
+          <w:b w:val="0"/>
+          <w:i w:val="0"/>
+          <w:color w:val="1A1A1A"/>
+          <w:sz w:val="22"/>
+        </w:rPr>
+        <w:t xml:space="preserve"> (</w:t>
+      </w:r>
+      <w:r>
+        <w:rPr>
+          <w:rFonts w:ascii="SBL Hebrew" w:hAnsi="SBL Hebrew" w:cs="SBL Hebrew" w:eastAsia="SBL Hebrew"/>
+          <w:b w:val="0"/>
+          <w:i w:val="0"/>
+          <w:color w:val="1A1A1A"/>
+          <w:sz w:val="22"/>
+        </w:rPr>
+        <w:t>הַשָּׂרָף מִבְּרִיסְק</w:t>
+      </w:r>
+      <w:r>
+        <w:rPr>
+          <w:rFonts w:ascii="Georgia" w:hAnsi="Georgia" w:cs="SBL Hebrew" w:eastAsia="Georgia"/>
+          <w:b w:val="0"/>
+          <w:i w:val="0"/>
+          <w:color w:val="1A1A1A"/>
+          <w:sz w:val="22"/>
+        </w:rPr>
+        <w:t>)</w:t>
       </w:r>
       <w:r>
         <w:rPr>
@@ -7294,7 +9074,27 @@
           <w:color w:val="1A1A1A"/>
           <w:sz w:val="22"/>
         </w:rPr>
-        <w:t xml:space="preserve"> — the </w:t>
+        <w:t xml:space="preserve"> (</w:t>
+      </w:r>
+      <w:r>
+        <w:rPr>
+          <w:rFonts w:ascii="SBL Hebrew" w:hAnsi="SBL Hebrew" w:cs="SBL Hebrew" w:eastAsia="SBL Hebrew"/>
+          <w:b w:val="0"/>
+          <w:i w:val="0"/>
+          <w:color w:val="1A1A1A"/>
+          <w:sz w:val="22"/>
+        </w:rPr>
+        <w:t>רַב יְהוֹשֻׁעַ לֵיב דִּיסְקִין</w:t>
+      </w:r>
+      <w:r>
+        <w:rPr>
+          <w:rFonts w:ascii="Georgia" w:hAnsi="Georgia" w:cs="SBL Hebrew" w:eastAsia="Georgia"/>
+          <w:b w:val="0"/>
+          <w:i w:val="0"/>
+          <w:color w:val="1A1A1A"/>
+          <w:sz w:val="22"/>
+        </w:rPr>
+        <w:t xml:space="preserve">) — the </w:t>
       </w:r>
       <w:r>
         <w:rPr>
@@ -7314,7 +9114,27 @@
           <w:color w:val="1A1A1A"/>
           <w:sz w:val="22"/>
         </w:rPr>
-        <w:t xml:space="preserve"> — assumed the rabbinate of </w:t>
+        <w:t xml:space="preserve"> (</w:t>
+      </w:r>
+      <w:r>
+        <w:rPr>
+          <w:rFonts w:ascii="SBL Hebrew" w:hAnsi="SBL Hebrew" w:cs="SBL Hebrew" w:eastAsia="SBL Hebrew"/>
+          <w:b w:val="0"/>
+          <w:i w:val="0"/>
+          <w:color w:val="1A1A1A"/>
+          <w:sz w:val="22"/>
+        </w:rPr>
+        <w:t>מַהֲרִי"ל דִּיסְקִין</w:t>
+      </w:r>
+      <w:r>
+        <w:rPr>
+          <w:rFonts w:ascii="Georgia" w:hAnsi="Georgia" w:cs="SBL Hebrew" w:eastAsia="Georgia"/>
+          <w:b w:val="0"/>
+          <w:i w:val="0"/>
+          <w:color w:val="1A1A1A"/>
+          <w:sz w:val="22"/>
+        </w:rPr>
+        <w:t xml:space="preserve">) — assumed the rabbinate of </w:t>
       </w:r>
       <w:r>
         <w:rPr>
@@ -7354,7 +9174,27 @@
           <w:color w:val="1A1A1A"/>
           <w:sz w:val="22"/>
         </w:rPr>
-        <w:t xml:space="preserve"> of the generation. Yet Brisk was Brisk, and the elder scholars of the city did not all welcome his appointment. Among them was a particularly senior </w:t>
+        <w:t xml:space="preserve"> (</w:t>
+      </w:r>
+      <w:r>
+        <w:rPr>
+          <w:rFonts w:ascii="SBL Hebrew" w:hAnsi="SBL Hebrew" w:cs="SBL Hebrew" w:eastAsia="SBL Hebrew"/>
+          <w:b w:val="0"/>
+          <w:i w:val="0"/>
+          <w:color w:val="1A1A1A"/>
+          <w:sz w:val="22"/>
+        </w:rPr>
+        <w:t>תַּלְמִידֵי חֲכָמִים</w:t>
+      </w:r>
+      <w:r>
+        <w:rPr>
+          <w:rFonts w:ascii="Georgia" w:hAnsi="Georgia" w:cs="SBL Hebrew" w:eastAsia="Georgia"/>
+          <w:b w:val="0"/>
+          <w:i w:val="0"/>
+          <w:color w:val="1A1A1A"/>
+          <w:sz w:val="22"/>
+        </w:rPr>
+        <w:t xml:space="preserve">) of the generation. Yet Brisk was Brisk, and the elder scholars of the city did not all welcome his appointment. Among them was a particularly senior </w:t>
       </w:r>
       <w:r>
         <w:rPr>
@@ -7489,7 +9329,27 @@
           <w:color w:val="1A1A1A"/>
           <w:sz w:val="22"/>
         </w:rPr>
-        <w:t xml:space="preserve"> of the </w:t>
+        <w:t xml:space="preserve"> (</w:t>
+      </w:r>
+      <w:r>
+        <w:rPr>
+          <w:rFonts w:ascii="SBL Hebrew" w:hAnsi="SBL Hebrew" w:cs="SBL Hebrew" w:eastAsia="SBL Hebrew"/>
+          <w:b w:val="0"/>
+          <w:i w:val="0"/>
+          <w:color w:val="1A1A1A"/>
+          <w:sz w:val="22"/>
+        </w:rPr>
+        <w:t>מַחְלֹקֶת</w:t>
+      </w:r>
+      <w:r>
+        <w:rPr>
+          <w:rFonts w:ascii="Georgia" w:hAnsi="Georgia" w:cs="SBL Hebrew" w:eastAsia="Georgia"/>
+          <w:b w:val="0"/>
+          <w:i w:val="0"/>
+          <w:color w:val="1A1A1A"/>
+          <w:sz w:val="22"/>
+        </w:rPr>
+        <w:t xml:space="preserve">) of the </w:t>
       </w:r>
       <w:r>
         <w:rPr>
@@ -7589,7 +9449,27 @@
           <w:color w:val="1A1A1A"/>
           <w:sz w:val="22"/>
         </w:rPr>
-        <w:t xml:space="preserve">, he resolved to bring the </w:t>
+        <w:t xml:space="preserve"> (</w:t>
+      </w:r>
+      <w:r>
+        <w:rPr>
+          <w:rFonts w:ascii="SBL Hebrew" w:hAnsi="SBL Hebrew" w:cs="SBL Hebrew" w:eastAsia="SBL Hebrew"/>
+          <w:b w:val="0"/>
+          <w:i w:val="0"/>
+          <w:color w:val="1A1A1A"/>
+          <w:sz w:val="22"/>
+        </w:rPr>
+        <w:t>קֻשְׁיָא</w:t>
+      </w:r>
+      <w:r>
+        <w:rPr>
+          <w:rFonts w:ascii="Georgia" w:hAnsi="Georgia" w:cs="SBL Hebrew" w:eastAsia="Georgia"/>
+          <w:b w:val="0"/>
+          <w:i w:val="0"/>
+          <w:color w:val="1A1A1A"/>
+          <w:sz w:val="22"/>
+        </w:rPr>
+        <w:t xml:space="preserve">), he resolved to bring the </w:t>
       </w:r>
       <w:r>
         <w:rPr>
@@ -7609,7 +9489,27 @@
           <w:color w:val="1A1A1A"/>
           <w:sz w:val="22"/>
         </w:rPr>
-        <w:t xml:space="preserve"> of Brisk into alignment with the </w:t>
+        <w:t xml:space="preserve"> (</w:t>
+      </w:r>
+      <w:r>
+        <w:rPr>
+          <w:rFonts w:ascii="SBL Hebrew" w:hAnsi="SBL Hebrew" w:cs="SBL Hebrew" w:eastAsia="SBL Hebrew"/>
+          <w:b w:val="0"/>
+          <w:i w:val="0"/>
+          <w:color w:val="1A1A1A"/>
+          <w:sz w:val="22"/>
+        </w:rPr>
+        <w:t>סִפְרֵי תּוֹרָה</w:t>
+      </w:r>
+      <w:r>
+        <w:rPr>
+          <w:rFonts w:ascii="Georgia" w:hAnsi="Georgia" w:cs="SBL Hebrew" w:eastAsia="Georgia"/>
+          <w:b w:val="0"/>
+          <w:i w:val="0"/>
+          <w:color w:val="1A1A1A"/>
+          <w:sz w:val="22"/>
+        </w:rPr>
+        <w:t xml:space="preserve">) of Brisk into alignment with the </w:t>
       </w:r>
       <w:r>
         <w:rPr>
@@ -7689,7 +9589,27 @@
           <w:color w:val="1A1A1A"/>
           <w:sz w:val="22"/>
         </w:rPr>
-        <w:t xml:space="preserve"> to alter the formatting of </w:t>
+        <w:t xml:space="preserve"> (</w:t>
+      </w:r>
+      <w:r>
+        <w:rPr>
+          <w:rFonts w:ascii="SBL Hebrew" w:hAnsi="SBL Hebrew" w:cs="SBL Hebrew" w:eastAsia="SBL Hebrew"/>
+          <w:b w:val="0"/>
+          <w:i w:val="0"/>
+          <w:color w:val="1A1A1A"/>
+          <w:sz w:val="22"/>
+        </w:rPr>
+        <w:t>סוֹפְרִים</w:t>
+      </w:r>
+      <w:r>
+        <w:rPr>
+          <w:rFonts w:ascii="Georgia" w:hAnsi="Georgia" w:cs="SBL Hebrew" w:eastAsia="Georgia"/>
+          <w:b w:val="0"/>
+          <w:i w:val="0"/>
+          <w:color w:val="1A1A1A"/>
+          <w:sz w:val="22"/>
+        </w:rPr>
+        <w:t xml:space="preserve">) to alter the formatting of </w:t>
       </w:r>
       <w:r>
         <w:rPr>
@@ -7954,7 +9874,27 @@
           <w:color w:val="1A1A1A"/>
           <w:sz w:val="22"/>
         </w:rPr>
-        <w:t xml:space="preserve">, the man went down to the </w:t>
+        <w:t xml:space="preserve"> (</w:t>
+      </w:r>
+      <w:r>
+        <w:rPr>
+          <w:rFonts w:ascii="SBL Hebrew" w:hAnsi="SBL Hebrew" w:cs="SBL Hebrew" w:eastAsia="SBL Hebrew"/>
+          <w:b w:val="0"/>
+          <w:i w:val="0"/>
+          <w:color w:val="1A1A1A"/>
+          <w:sz w:val="22"/>
+        </w:rPr>
+        <w:t>עֶרֶב שַׁבָּת</w:t>
+      </w:r>
+      <w:r>
+        <w:rPr>
+          <w:rFonts w:ascii="Georgia" w:hAnsi="Georgia" w:cs="SBL Hebrew" w:eastAsia="Georgia"/>
+          <w:b w:val="0"/>
+          <w:i w:val="0"/>
+          <w:color w:val="1A1A1A"/>
+          <w:sz w:val="22"/>
+        </w:rPr>
+        <w:t xml:space="preserve">), the man went down to the </w:t>
       </w:r>
       <w:r>
         <w:rPr>
@@ -7974,7 +9914,27 @@
           <w:color w:val="1A1A1A"/>
           <w:sz w:val="22"/>
         </w:rPr>
-        <w:t xml:space="preserve">. He did not come up. He drowned in the water. </w:t>
+        <w:t xml:space="preserve"> (</w:t>
+      </w:r>
+      <w:r>
+        <w:rPr>
+          <w:rFonts w:ascii="SBL Hebrew" w:hAnsi="SBL Hebrew" w:cs="SBL Hebrew" w:eastAsia="SBL Hebrew"/>
+          <w:b w:val="0"/>
+          <w:i w:val="0"/>
+          <w:color w:val="1A1A1A"/>
+          <w:sz w:val="22"/>
+        </w:rPr>
+        <w:t>מִקְוֶה</w:t>
+      </w:r>
+      <w:r>
+        <w:rPr>
+          <w:rFonts w:ascii="Georgia" w:hAnsi="Georgia" w:cs="SBL Hebrew" w:eastAsia="Georgia"/>
+          <w:b w:val="0"/>
+          <w:i w:val="0"/>
+          <w:color w:val="1A1A1A"/>
+          <w:sz w:val="22"/>
+        </w:rPr>
+        <w:t xml:space="preserve">). He did not come up. He drowned in the water. </w:t>
       </w:r>
       <w:r>
         <w:rPr>
@@ -8014,7 +9974,27 @@
           <w:color w:val="1A1A1A"/>
           <w:sz w:val="22"/>
         </w:rPr>
-        <w:t xml:space="preserve">. The man had sought to alter the very verse that describes the water in which the Egyptians drowned. The water — the </w:t>
+        <w:t xml:space="preserve"> (</w:t>
+      </w:r>
+      <w:r>
+        <w:rPr>
+          <w:rFonts w:ascii="SBL Hebrew" w:hAnsi="SBL Hebrew" w:cs="SBL Hebrew" w:eastAsia="SBL Hebrew"/>
+          <w:b w:val="0"/>
+          <w:i w:val="0"/>
+          <w:color w:val="1A1A1A"/>
+          <w:sz w:val="22"/>
+        </w:rPr>
+        <w:t>מִדָּה כְּנֶגֶד מִדָּה</w:t>
+      </w:r>
+      <w:r>
+        <w:rPr>
+          <w:rFonts w:ascii="Georgia" w:hAnsi="Georgia" w:cs="SBL Hebrew" w:eastAsia="Georgia"/>
+          <w:b w:val="0"/>
+          <w:i w:val="0"/>
+          <w:color w:val="1A1A1A"/>
+          <w:sz w:val="22"/>
+        </w:rPr>
+        <w:t xml:space="preserve">). The man had sought to alter the very verse that describes the water in which the Egyptians drowned. The water — the </w:t>
       </w:r>
       <w:r>
         <w:rPr>
@@ -8109,7 +10089,27 @@
           <w:color w:val="1A1A1A"/>
           <w:sz w:val="22"/>
         </w:rPr>
-        <w:t xml:space="preserve">, is a grave matter. The </w:t>
+        <w:t xml:space="preserve"> (</w:t>
+      </w:r>
+      <w:r>
+        <w:rPr>
+          <w:rFonts w:ascii="SBL Hebrew" w:hAnsi="SBL Hebrew" w:cs="SBL Hebrew" w:eastAsia="SBL Hebrew"/>
+          <w:b w:val="0"/>
+          <w:i w:val="0"/>
+          <w:color w:val="1A1A1A"/>
+          <w:sz w:val="22"/>
+        </w:rPr>
+        <w:t>סְבָרָא</w:t>
+      </w:r>
+      <w:r>
+        <w:rPr>
+          <w:rFonts w:ascii="Georgia" w:hAnsi="Georgia" w:cs="SBL Hebrew" w:eastAsia="Georgia"/>
+          <w:b w:val="0"/>
+          <w:i w:val="0"/>
+          <w:color w:val="1A1A1A"/>
+          <w:sz w:val="22"/>
+        </w:rPr>
+        <w:t xml:space="preserve">), is a grave matter. The </w:t>
       </w:r>
       <w:r>
         <w:rPr>
@@ -8229,7 +10229,27 @@
           <w:color w:val="1A1A1A"/>
           <w:sz w:val="22"/>
         </w:rPr>
-        <w:t xml:space="preserve">, for instance, comparing manuscripts to establish the accurate text — and the intrusion the story condemns. The line runs through the difference between correcting toward the received </w:t>
+        <w:t xml:space="preserve"> (</w:t>
+      </w:r>
+      <w:r>
+        <w:rPr>
+          <w:rFonts w:ascii="SBL Hebrew" w:hAnsi="SBL Hebrew" w:cs="SBL Hebrew" w:eastAsia="SBL Hebrew"/>
+          <w:b w:val="0"/>
+          <w:i w:val="0"/>
+          <w:color w:val="1A1A1A"/>
+          <w:sz w:val="22"/>
+        </w:rPr>
+        <w:t>מִנְחַת שַׁי</w:t>
+      </w:r>
+      <w:r>
+        <w:rPr>
+          <w:rFonts w:ascii="Georgia" w:hAnsi="Georgia" w:cs="SBL Hebrew" w:eastAsia="Georgia"/>
+          <w:b w:val="0"/>
+          <w:i w:val="0"/>
+          <w:color w:val="1A1A1A"/>
+          <w:sz w:val="22"/>
+        </w:rPr>
+        <w:t xml:space="preserve">), for instance, comparing manuscripts to establish the accurate text — and the intrusion the story condemns. The line runs through the difference between correcting toward the received </w:t>
       </w:r>
       <w:r>
         <w:rPr>
@@ -8728,7 +10748,27 @@
           <w:color w:val="1A1A1A"/>
           <w:sz w:val="22"/>
         </w:rPr>
-        <w:t xml:space="preserve">, on whose </w:t>
+        <w:t xml:space="preserve"> (</w:t>
+      </w:r>
+      <w:r>
+        <w:rPr>
+          <w:rFonts w:ascii="SBL Hebrew" w:hAnsi="SBL Hebrew" w:cs="SBL Hebrew" w:eastAsia="SBL Hebrew"/>
+          <w:b w:val="0"/>
+          <w:i w:val="0"/>
+          <w:color w:val="1A1A1A"/>
+          <w:sz w:val="22"/>
+        </w:rPr>
+        <w:t>רֶב חַיִּים בְּרִיסְקֶר</w:t>
+      </w:r>
+      <w:r>
+        <w:rPr>
+          <w:rFonts w:ascii="Georgia" w:hAnsi="Georgia" w:cs="SBL Hebrew" w:eastAsia="Georgia"/>
+          <w:b w:val="0"/>
+          <w:i w:val="0"/>
+          <w:color w:val="1A1A1A"/>
+          <w:sz w:val="22"/>
+        </w:rPr>
+        <w:t xml:space="preserve">), on whose </w:t>
       </w:r>
       <w:r>
         <w:rPr>
@@ -8768,7 +10808,27 @@
           <w:color w:val="1A1A1A"/>
           <w:sz w:val="22"/>
         </w:rPr>
-        <w:t xml:space="preserve"> was delivered, brought to every word of the </w:t>
+        <w:t xml:space="preserve"> (</w:t>
+      </w:r>
+      <w:r>
+        <w:rPr>
+          <w:rFonts w:ascii="SBL Hebrew" w:hAnsi="SBL Hebrew" w:cs="SBL Hebrew" w:eastAsia="SBL Hebrew"/>
+          <w:b w:val="0"/>
+          <w:i w:val="0"/>
+          <w:color w:val="1A1A1A"/>
+          <w:sz w:val="22"/>
+        </w:rPr>
+        <w:t>שִׁיעוּר</w:t>
+      </w:r>
+      <w:r>
+        <w:rPr>
+          <w:rFonts w:ascii="Georgia" w:hAnsi="Georgia" w:cs="SBL Hebrew" w:eastAsia="Georgia"/>
+          <w:b w:val="0"/>
+          <w:i w:val="0"/>
+          <w:color w:val="1A1A1A"/>
+          <w:sz w:val="22"/>
+        </w:rPr>
+        <w:t xml:space="preserve">) was delivered, brought to every word of the </w:t>
       </w:r>
       <w:r>
         <w:rPr>
@@ -8908,7 +10968,27 @@
           <w:color w:val="1A1A1A"/>
           <w:sz w:val="22"/>
         </w:rPr>
-        <w:t>.</w:t>
+        <w:t xml:space="preserve"> (</w:t>
+      </w:r>
+      <w:r>
+        <w:rPr>
+          <w:rFonts w:ascii="SBL Hebrew" w:hAnsi="SBL Hebrew" w:cs="SBL Hebrew" w:eastAsia="SBL Hebrew"/>
+          <w:b w:val="0"/>
+          <w:i w:val="0"/>
+          <w:color w:val="1A1A1A"/>
+          <w:sz w:val="22"/>
+        </w:rPr>
+        <w:t>מֻבְטָח לוֹ שֶׁהוּא בֶּן עוֹלָם הַבָּא</w:t>
+      </w:r>
+      <w:r>
+        <w:rPr>
+          <w:rFonts w:ascii="Georgia" w:hAnsi="Georgia" w:cs="SBL Hebrew" w:eastAsia="Georgia"/>
+          <w:b w:val="0"/>
+          <w:i w:val="0"/>
+          <w:color w:val="1A1A1A"/>
+          <w:sz w:val="22"/>
+        </w:rPr>
+        <w:t>).</w:t>
       </w:r>
     </w:p>
     <w:p>

</xml_diff>